<commit_message>
Deploying to gh-pages from @ Morrison-Lab/sds@a123950f9ed447ea104b42448904c9c685c7a6b1 🚀
</commit_message>
<xml_diff>
--- a/index.docx
+++ b/index.docx
@@ -7,7 +7,7 @@
         <w:pStyle w:val="Title"/>
       </w:pPr>
       <w:r>
-        <w:t xml:space="preserve">Quarto Website Template</w:t>
+        <w:t xml:space="preserve">Statistics for Data Science</w:t>
       </w:r>
     </w:p>
     <w:p>
@@ -15,10 +15,10 @@
         <w:pStyle w:val="Date"/>
       </w:pPr>
       <w:r>
-        <w:t xml:space="preserve">Last modified: 2026-09-25 15:37:17 (PDT)</w:t>
+        <w:t xml:space="preserve">Last modified: 2026-09-25 16:46:08 (PDT)</w:t>
       </w:r>
     </w:p>
-    <w:bookmarkStart w:id="17" w:name="welcome"/>
+    <w:bookmarkStart w:id="10" w:name="welcome"/>
     <w:p>
       <w:pPr>
         <w:pStyle w:val="Heading1"/>
@@ -32,53 +32,24 @@
         <w:pStyle w:val="FirstParagraph"/>
       </w:pPr>
       <w:r>
-        <w:t xml:space="preserve">This is a Quarto website template that you can use to create your own website.</w:t>
+        <w:t xml:space="preserve">These notes collect the statistics that data science courses assume.</w:t>
+      </w:r>
+    </w:p>
+    <w:bookmarkStart w:id="9" w:name="using-these-notes-in-another-site"/>
+    <w:p>
+      <w:pPr>
+        <w:pStyle w:val="Heading2"/>
+      </w:pPr>
+      <w:r>
+        <w:t xml:space="preserve">0.1 Using these notes in another site</w:t>
       </w:r>
     </w:p>
     <w:p>
       <w:pPr>
-        <w:pStyle w:val="BodyText"/>
-      </w:pPr>
-      <w:r>
-        <w:t xml:space="preserve">The notes are available in multiple formats:</w:t>
-      </w:r>
-    </w:p>
-    <w:p>
-      <w:pPr>
-        <w:pStyle w:val="Compact"/>
-        <w:numPr>
-          <w:ilvl w:val="0"/>
-          <w:numId w:val="1001"/>
-        </w:numPr>
-      </w:pPr>
-      <w:r>
-        <w:rPr>
-          <w:b/>
-          <w:bCs/>
-        </w:rPr>
-        <w:t xml:space="preserve">HTML Website</w:t>
-      </w:r>
-      <w:r>
-        <w:t xml:space="preserve">: Navigate using the navbar for easy access to all pages</w:t>
-      </w:r>
-    </w:p>
-    <w:p>
-      <w:pPr>
-        <w:pStyle w:val="Compact"/>
-        <w:numPr>
-          <w:ilvl w:val="0"/>
-          <w:numId w:val="1001"/>
-        </w:numPr>
-      </w:pPr>
-      <w:r>
-        <w:rPr>
-          <w:b/>
-          <w:bCs/>
-        </w:rPr>
-        <w:t xml:space="preserve">RevealJS Slides</w:t>
-      </w:r>
-      <w:r>
-        <w:t xml:space="preserve">: Each chapter can generate a presentation format with</w:t>
+        <w:pStyle w:val="FirstParagraph"/>
+      </w:pPr>
+      <w:r>
+        <w:t xml:space="preserve">Course sites include these notes as a git submodule named</w:t>
       </w:r>
       <w:r>
         <w:t xml:space="preserve"> </w:t>
@@ -87,32 +58,19 @@
         <w:rPr>
           <w:rStyle w:val="VerbatimChar"/>
         </w:rPr>
-        <w:t xml:space="preserve">-slides.html</w:t>
+        <w:t xml:space="preserve">sds</w:t>
       </w:r>
       <w:r>
         <w:t xml:space="preserve"> </w:t>
       </w:r>
       <w:r>
-        <w:t xml:space="preserve">suffix</w:t>
-      </w:r>
-    </w:p>
-    <w:p>
-      <w:pPr>
-        <w:pStyle w:val="Compact"/>
-        <w:numPr>
-          <w:ilvl w:val="0"/>
-          <w:numId w:val="1001"/>
-        </w:numPr>
-      </w:pPr>
-      <w:r>
-        <w:rPr>
-          <w:b/>
-          <w:bCs/>
-        </w:rPr>
-        <w:t xml:space="preserve">PDF Handouts</w:t>
-      </w:r>
-      <w:r>
-        <w:t xml:space="preserve">: Each chapter can generate a PDF handout with</w:t>
+        <w:t xml:space="preserve">at the site’s root,</w:t>
+      </w:r>
+      <w:r>
+        <w:t xml:space="preserve"> </w:t>
+      </w:r>
+      <w:r>
+        <w:t xml:space="preserve">and include fragments with paths that start with</w:t>
       </w:r>
       <w:r>
         <w:t xml:space="preserve"> </w:t>
@@ -121,32 +79,18 @@
         <w:rPr>
           <w:rStyle w:val="VerbatimChar"/>
         </w:rPr>
-        <w:t xml:space="preserve">-handout.pdf</w:t>
-      </w:r>
-      <w:r>
-        <w:t xml:space="preserve"> </w:t>
-      </w:r>
-      <w:r>
-        <w:t xml:space="preserve">suffix</w:t>
+        <w:t xml:space="preserve">sds/</w:t>
+      </w:r>
+      <w:r>
+        <w:t xml:space="preserve">.</w:t>
       </w:r>
     </w:p>
     <w:p>
       <w:pPr>
-        <w:pStyle w:val="Compact"/>
-        <w:numPr>
-          <w:ilvl w:val="0"/>
-          <w:numId w:val="1001"/>
-        </w:numPr>
-      </w:pPr>
-      <w:r>
-        <w:rPr>
-          <w:b/>
-          <w:bCs/>
-        </w:rPr>
-        <w:t xml:space="preserve">DOCX Documents</w:t>
-      </w:r>
-      <w:r>
-        <w:t xml:space="preserve">: Each chapter can generate a Microsoft Word document with</w:t>
+        <w:pStyle w:val="BodyText"/>
+      </w:pPr>
+      <w:r>
+        <w:t xml:space="preserve">Quarto resolves</w:t>
       </w:r>
       <w:r>
         <w:t xml:space="preserve"> </w:t>
@@ -155,453 +99,29 @@
         <w:rPr>
           <w:rStyle w:val="VerbatimChar"/>
         </w:rPr>
-        <w:t xml:space="preserve">.docx</w:t>
+        <w:t xml:space="preserve">@id</w:t>
       </w:r>
       <w:r>
         <w:t xml:space="preserve"> </w:t>
       </w:r>
       <w:r>
-        <w:t xml:space="preserve">extension</w:t>
+        <w:t xml:space="preserve">cross-references only within one rendered page,</w:t>
+      </w:r>
+      <w:r>
+        <w:t xml:space="preserve"> </w:t>
+      </w:r>
+      <w:r>
+        <w:t xml:space="preserve">so a host site that links to a result here</w:t>
+      </w:r>
+      <w:r>
+        <w:t xml:space="preserve"> </w:t>
+      </w:r>
+      <w:r>
+        <w:t xml:space="preserve">uses an explicit link to the page and anchor.</w:t>
       </w:r>
     </w:p>
-    <w:bookmarkStart w:id="10" w:name="about-this-website"/>
-    <w:p>
-      <w:pPr>
-        <w:pStyle w:val="Heading2"/>
-      </w:pPr>
-      <w:r>
-        <w:t xml:space="preserve">0.1 About this website</w:t>
-      </w:r>
-    </w:p>
-    <w:p>
-      <w:pPr>
-        <w:pStyle w:val="FirstParagraph"/>
-      </w:pPr>
-      <w:r>
-        <w:t xml:space="preserve">This website is built with</w:t>
-      </w:r>
-      <w:r>
-        <w:t xml:space="preserve"> </w:t>
-      </w:r>
-      <w:hyperlink r:id="rId9">
-        <w:r>
-          <w:rPr>
-            <w:rStyle w:val="Hyperlink"/>
-          </w:rPr>
-          <w:t xml:space="preserve">Quarto</w:t>
-        </w:r>
-      </w:hyperlink>
-      <w:r>
-        <w:t xml:space="preserve">, an open-source scientific and technical publishing system. You can use Quarto to create books, websites, blogs, presentations, and more from markdown files.</w:t>
-      </w:r>
-    </w:p>
+    <w:bookmarkEnd w:id="9"/>
     <w:bookmarkEnd w:id="10"/>
-    <w:bookmarkStart w:id="11" w:name="getting-started"/>
-    <w:p>
-      <w:pPr>
-        <w:pStyle w:val="Heading2"/>
-      </w:pPr>
-      <w:r>
-        <w:t xml:space="preserve">0.2 Getting Started</w:t>
-      </w:r>
-    </w:p>
-    <w:p>
-      <w:pPr>
-        <w:pStyle w:val="FirstParagraph"/>
-      </w:pPr>
-      <w:r>
-        <w:t xml:space="preserve">To use this template:</w:t>
-      </w:r>
-    </w:p>
-    <w:p>
-      <w:pPr>
-        <w:numPr>
-          <w:ilvl w:val="0"/>
-          <w:numId w:val="1002"/>
-        </w:numPr>
-      </w:pPr>
-      <w:r>
-        <w:rPr>
-          <w:b/>
-          <w:bCs/>
-        </w:rPr>
-        <w:t xml:space="preserve">Update the configuration</w:t>
-      </w:r>
-      <w:r>
-        <w:t xml:space="preserve">: Edit</w:t>
-      </w:r>
-      <w:r>
-        <w:t xml:space="preserve"> </w:t>
-      </w:r>
-      <w:r>
-        <w:rPr>
-          <w:rStyle w:val="VerbatimChar"/>
-        </w:rPr>
-        <w:t xml:space="preserve">_quarto-website.yml</w:t>
-      </w:r>
-      <w:r>
-        <w:t xml:space="preserve"> </w:t>
-      </w:r>
-      <w:r>
-        <w:t xml:space="preserve">to change the website title, site URL, and navigation menu.</w:t>
-      </w:r>
-    </w:p>
-    <w:p>
-      <w:pPr>
-        <w:numPr>
-          <w:ilvl w:val="0"/>
-          <w:numId w:val="1002"/>
-        </w:numPr>
-      </w:pPr>
-      <w:r>
-        <w:rPr>
-          <w:b/>
-          <w:bCs/>
-        </w:rPr>
-        <w:t xml:space="preserve">Add your content</w:t>
-      </w:r>
-      <w:r>
-        <w:t xml:space="preserve">: Create new</w:t>
-      </w:r>
-      <w:r>
-        <w:t xml:space="preserve"> </w:t>
-      </w:r>
-      <w:r>
-        <w:rPr>
-          <w:rStyle w:val="VerbatimChar"/>
-        </w:rPr>
-        <w:t xml:space="preserve">.qmd</w:t>
-      </w:r>
-      <w:r>
-        <w:t xml:space="preserve"> </w:t>
-      </w:r>
-      <w:r>
-        <w:t xml:space="preserve">files for each page and add them to the navigation menu in</w:t>
-      </w:r>
-      <w:r>
-        <w:t xml:space="preserve"> </w:t>
-      </w:r>
-      <w:r>
-        <w:rPr>
-          <w:rStyle w:val="VerbatimChar"/>
-        </w:rPr>
-        <w:t xml:space="preserve">_quarto-website.yml</w:t>
-      </w:r>
-      <w:r>
-        <w:t xml:space="preserve">.</w:t>
-      </w:r>
-    </w:p>
-    <w:p>
-      <w:pPr>
-        <w:numPr>
-          <w:ilvl w:val="0"/>
-          <w:numId w:val="1002"/>
-        </w:numPr>
-      </w:pPr>
-      <w:r>
-        <w:rPr>
-          <w:b/>
-          <w:bCs/>
-        </w:rPr>
-        <w:t xml:space="preserve">Customize the style</w:t>
-      </w:r>
-      <w:r>
-        <w:t xml:space="preserve">: Modify</w:t>
-      </w:r>
-      <w:r>
-        <w:t xml:space="preserve"> </w:t>
-      </w:r>
-      <w:r>
-        <w:rPr>
-          <w:rStyle w:val="VerbatimChar"/>
-        </w:rPr>
-        <w:t xml:space="preserve">styles.css</w:t>
-      </w:r>
-      <w:r>
-        <w:t xml:space="preserve"> </w:t>
-      </w:r>
-      <w:r>
-        <w:t xml:space="preserve">to change the appearance of your website.</w:t>
-      </w:r>
-    </w:p>
-    <w:p>
-      <w:pPr>
-        <w:numPr>
-          <w:ilvl w:val="0"/>
-          <w:numId w:val="1002"/>
-        </w:numPr>
-      </w:pPr>
-      <w:r>
-        <w:rPr>
-          <w:b/>
-          <w:bCs/>
-        </w:rPr>
-        <w:t xml:space="preserve">Add references</w:t>
-      </w:r>
-      <w:r>
-        <w:t xml:space="preserve">: Update</w:t>
-      </w:r>
-      <w:r>
-        <w:t xml:space="preserve"> </w:t>
-      </w:r>
-      <w:r>
-        <w:rPr>
-          <w:rStyle w:val="VerbatimChar"/>
-        </w:rPr>
-        <w:t xml:space="preserve">references.bib</w:t>
-      </w:r>
-      <w:r>
-        <w:t xml:space="preserve"> </w:t>
-      </w:r>
-      <w:r>
-        <w:t xml:space="preserve">with your citations.</w:t>
-      </w:r>
-    </w:p>
-    <w:bookmarkEnd w:id="11"/>
-    <w:bookmarkStart w:id="12" w:name="building-the-website"/>
-    <w:p>
-      <w:pPr>
-        <w:pStyle w:val="Heading2"/>
-      </w:pPr>
-      <w:r>
-        <w:t xml:space="preserve">0.3 Building the website</w:t>
-      </w:r>
-    </w:p>
-    <w:p>
-      <w:pPr>
-        <w:pStyle w:val="FirstParagraph"/>
-      </w:pPr>
-      <w:r>
-        <w:t xml:space="preserve">To render the website locally:</w:t>
-      </w:r>
-    </w:p>
-    <w:p>
-      <w:pPr>
-        <w:pStyle w:val="SourceCode"/>
-      </w:pPr>
-      <w:r>
-        <w:rPr>
-          <w:rStyle w:val="ExtensionTok"/>
-        </w:rPr>
-        <w:t xml:space="preserve">quarto</w:t>
-      </w:r>
-      <w:r>
-        <w:rPr>
-          <w:rStyle w:val="NormalTok"/>
-        </w:rPr>
-        <w:t xml:space="preserve"> render</w:t>
-      </w:r>
-    </w:p>
-    <w:p>
-      <w:pPr>
-        <w:pStyle w:val="FirstParagraph"/>
-      </w:pPr>
-      <w:r>
-        <w:t xml:space="preserve">To preview the website with live reload:</w:t>
-      </w:r>
-    </w:p>
-    <w:p>
-      <w:pPr>
-        <w:pStyle w:val="SourceCode"/>
-      </w:pPr>
-      <w:r>
-        <w:rPr>
-          <w:rStyle w:val="ExtensionTok"/>
-        </w:rPr>
-        <w:t xml:space="preserve">quarto</w:t>
-      </w:r>
-      <w:r>
-        <w:rPr>
-          <w:rStyle w:val="NormalTok"/>
-        </w:rPr>
-        <w:t xml:space="preserve"> preview</w:t>
-      </w:r>
-    </w:p>
-    <w:p>
-      <w:pPr>
-        <w:pStyle w:val="FirstParagraph"/>
-      </w:pPr>
-      <w:r>
-        <w:t xml:space="preserve">The rendered output will be in the</w:t>
-      </w:r>
-      <w:r>
-        <w:t xml:space="preserve"> </w:t>
-      </w:r>
-      <w:r>
-        <w:rPr>
-          <w:rStyle w:val="VerbatimChar"/>
-        </w:rPr>
-        <w:t xml:space="preserve">_site/</w:t>
-      </w:r>
-      <w:r>
-        <w:t xml:space="preserve"> </w:t>
-      </w:r>
-      <w:r>
-        <w:t xml:space="preserve">directory, which can be published to GitHub Pages.</w:t>
-      </w:r>
-    </w:p>
-    <w:bookmarkEnd w:id="12"/>
-    <w:bookmarkStart w:id="13" w:name="publishing-to-github-pages"/>
-    <w:p>
-      <w:pPr>
-        <w:pStyle w:val="Heading2"/>
-      </w:pPr>
-      <w:r>
-        <w:t xml:space="preserve">0.4 Publishing to GitHub Pages</w:t>
-      </w:r>
-    </w:p>
-    <w:p>
-      <w:pPr>
-        <w:pStyle w:val="FirstParagraph"/>
-      </w:pPr>
-      <w:r>
-        <w:t xml:space="preserve">This template includes a GitHub Actions workflow that automatically builds and publishes your website to GitHub Pages when you push to the main branch.</w:t>
-      </w:r>
-    </w:p>
-    <w:p>
-      <w:pPr>
-        <w:pStyle w:val="BodyText"/>
-      </w:pPr>
-      <w:r>
-        <w:t xml:space="preserve">To enable GitHub Pages:</w:t>
-      </w:r>
-    </w:p>
-    <w:p>
-      <w:pPr>
-        <w:pStyle w:val="Compact"/>
-        <w:numPr>
-          <w:ilvl w:val="0"/>
-          <w:numId w:val="1003"/>
-        </w:numPr>
-      </w:pPr>
-      <w:r>
-        <w:t xml:space="preserve">Go to your repository settings</w:t>
-      </w:r>
-    </w:p>
-    <w:p>
-      <w:pPr>
-        <w:pStyle w:val="Compact"/>
-        <w:numPr>
-          <w:ilvl w:val="0"/>
-          <w:numId w:val="1003"/>
-        </w:numPr>
-      </w:pPr>
-      <w:r>
-        <w:t xml:space="preserve">Navigate to</w:t>
-      </w:r>
-      <w:r>
-        <w:t xml:space="preserve"> </w:t>
-      </w:r>
-      <w:r>
-        <w:t xml:space="preserve">“Pages”</w:t>
-      </w:r>
-      <w:r>
-        <w:t xml:space="preserve"> </w:t>
-      </w:r>
-      <w:r>
-        <w:t xml:space="preserve">in the left sidebar</w:t>
-      </w:r>
-    </w:p>
-    <w:p>
-      <w:pPr>
-        <w:pStyle w:val="Compact"/>
-        <w:numPr>
-          <w:ilvl w:val="0"/>
-          <w:numId w:val="1003"/>
-        </w:numPr>
-      </w:pPr>
-      <w:r>
-        <w:t xml:space="preserve">Under</w:t>
-      </w:r>
-      <w:r>
-        <w:t xml:space="preserve"> </w:t>
-      </w:r>
-      <w:r>
-        <w:t xml:space="preserve">“Build and deployment”</w:t>
-      </w:r>
-      <w:r>
-        <w:t xml:space="preserve">, set Source to</w:t>
-      </w:r>
-      <w:r>
-        <w:t xml:space="preserve"> </w:t>
-      </w:r>
-      <w:r>
-        <w:t xml:space="preserve">“GitHub Actions”</w:t>
-      </w:r>
-    </w:p>
-    <w:p>
-      <w:pPr>
-        <w:pStyle w:val="Compact"/>
-        <w:numPr>
-          <w:ilvl w:val="0"/>
-          <w:numId w:val="1003"/>
-        </w:numPr>
-      </w:pPr>
-      <w:r>
-        <w:t xml:space="preserve">Push your changes to the main branch</w:t>
-      </w:r>
-    </w:p>
-    <w:p>
-      <w:pPr>
-        <w:pStyle w:val="Compact"/>
-        <w:numPr>
-          <w:ilvl w:val="0"/>
-          <w:numId w:val="1003"/>
-        </w:numPr>
-      </w:pPr>
-      <w:r>
-        <w:t xml:space="preserve">The workflow will automatically build and deploy your website</w:t>
-      </w:r>
-    </w:p>
-    <w:p>
-      <w:pPr>
-        <w:pStyle w:val="FirstParagraph"/>
-      </w:pPr>
-      <w:r>
-        <w:t xml:space="preserve">Your website will be available at</w:t>
-      </w:r>
-      <w:r>
-        <w:t xml:space="preserve"> </w:t>
-      </w:r>
-      <w:r>
-        <w:rPr>
-          <w:rStyle w:val="VerbatimChar"/>
-        </w:rPr>
-        <w:t xml:space="preserve">https://YOUR-USERNAME.github.io/YOUR-REPO/</w:t>
-      </w:r>
-    </w:p>
-    <w:bookmarkEnd w:id="13"/>
-    <w:bookmarkStart w:id="14" w:name="license"/>
-    <w:p>
-      <w:pPr>
-        <w:pStyle w:val="Heading2"/>
-      </w:pPr>
-      <w:r>
-        <w:t xml:space="preserve">0.5 License</w:t>
-      </w:r>
-    </w:p>
-    <w:p>
-      <w:pPr>
-        <w:pStyle w:val="FirstParagraph"/>
-      </w:pPr>
-      <w:r>
-        <w:t xml:space="preserve">Add your license information here.</w:t>
-      </w:r>
-    </w:p>
-    <w:bookmarkEnd w:id="14"/>
-    <w:bookmarkStart w:id="16" w:name="references"/>
-    <w:p>
-      <w:pPr>
-        <w:pStyle w:val="Heading2"/>
-      </w:pPr>
-      <w:r>
-        <w:t xml:space="preserve">References</w:t>
-      </w:r>
-    </w:p>
-    <w:bookmarkStart w:id="15" w:name="refs"/>
-    <w:bookmarkEnd w:id="15"/>
-    <w:bookmarkEnd w:id="16"/>
-    <w:bookmarkEnd w:id="17"/>
     <w:sectPr>
       <w:footnotePr>
         <w:numRestart w:val="eachSect"/>
@@ -712,259 +232,8 @@
       </w:pPr>
     </w:lvl>
   </w:abstractNum>
-  <w:abstractNum w:abstractNumId="991">
-    <w:nsid w:val="0000A991"/>
-    <w:multiLevelType w:val="multilevel"/>
-    <w:lvl w:ilvl="0">
-      <w:numFmt w:val="bullet"/>
-      <w:lvlText w:val=""/>
-      <w:lvlJc w:val="left"/>
-      <w:pPr>
-        <w:ind w:left="720" w:hanging="360"/>
-      </w:pPr>
-      <w:rPr>
-        <w:rFonts w:ascii="Symbol" w:hAnsi="Symbol" w:cs="Symbol" w:hint="default"/>
-      </w:rPr>
-    </w:lvl>
-    <w:lvl w:ilvl="1">
-      <w:numFmt w:val="bullet"/>
-      <w:lvlText w:val="o"/>
-      <w:lvlJc w:val="left"/>
-      <w:pPr>
-        <w:ind w:left="1440" w:hanging="360"/>
-      </w:pPr>
-      <w:rPr>
-        <w:rFonts w:ascii="Courier New" w:hAnsi="Courier New" w:cs="Courier New" w:hint="default"/>
-      </w:rPr>
-    </w:lvl>
-    <w:lvl w:ilvl="2">
-      <w:numFmt w:val="bullet"/>
-      <w:lvlText w:val=""/>
-      <w:lvlJc w:val="left"/>
-      <w:pPr>
-        <w:ind w:left="2160" w:hanging="360"/>
-      </w:pPr>
-      <w:rPr>
-        <w:rFonts w:ascii="Wingdings" w:hAnsi="Wingdings" w:cs="Wingdings" w:hint="default"/>
-      </w:rPr>
-    </w:lvl>
-    <w:lvl w:ilvl="3">
-      <w:numFmt w:val="bullet"/>
-      <w:lvlText w:val=""/>
-      <w:lvlJc w:val="left"/>
-      <w:pPr>
-        <w:ind w:left="2880" w:hanging="360"/>
-      </w:pPr>
-      <w:rPr>
-        <w:rFonts w:ascii="Symbol" w:hAnsi="Symbol" w:cs="Symbol" w:hint="default"/>
-      </w:rPr>
-    </w:lvl>
-    <w:lvl w:ilvl="4">
-      <w:numFmt w:val="bullet"/>
-      <w:lvlText w:val="o"/>
-      <w:lvlJc w:val="left"/>
-      <w:pPr>
-        <w:ind w:left="3600" w:hanging="360"/>
-      </w:pPr>
-      <w:rPr>
-        <w:rFonts w:ascii="Courier New" w:hAnsi="Courier New" w:cs="Courier New" w:hint="default"/>
-      </w:rPr>
-    </w:lvl>
-    <w:lvl w:ilvl="5">
-      <w:numFmt w:val="bullet"/>
-      <w:lvlText w:val=""/>
-      <w:lvlJc w:val="left"/>
-      <w:pPr>
-        <w:ind w:left="4320" w:hanging="360"/>
-      </w:pPr>
-      <w:rPr>
-        <w:rFonts w:ascii="Wingdings" w:hAnsi="Wingdings" w:cs="Wingdings" w:hint="default"/>
-      </w:rPr>
-    </w:lvl>
-    <w:lvl w:ilvl="6">
-      <w:numFmt w:val="bullet"/>
-      <w:lvlText w:val=""/>
-      <w:lvlJc w:val="left"/>
-      <w:pPr>
-        <w:ind w:left="5040" w:hanging="360"/>
-      </w:pPr>
-      <w:rPr>
-        <w:rFonts w:ascii="Symbol" w:hAnsi="Symbol" w:cs="Symbol" w:hint="default"/>
-      </w:rPr>
-    </w:lvl>
-    <w:lvl w:ilvl="7">
-      <w:numFmt w:val="bullet"/>
-      <w:lvlText w:val="o"/>
-      <w:lvlJc w:val="left"/>
-      <w:pPr>
-        <w:ind w:left="5760" w:hanging="360"/>
-      </w:pPr>
-      <w:rPr>
-        <w:rFonts w:ascii="Courier New" w:hAnsi="Courier New" w:cs="Courier New" w:hint="default"/>
-      </w:rPr>
-    </w:lvl>
-    <w:lvl w:ilvl="8">
-      <w:numFmt w:val="bullet"/>
-      <w:lvlText w:val=""/>
-      <w:lvlJc w:val="left"/>
-      <w:pPr>
-        <w:ind w:left="6480" w:hanging="360"/>
-      </w:pPr>
-      <w:rPr>
-        <w:rFonts w:ascii="Wingdings" w:hAnsi="Wingdings" w:cs="Wingdings" w:hint="default"/>
-      </w:rPr>
-    </w:lvl>
-  </w:abstractNum>
-  <w:abstractNum w:abstractNumId="99411">
-    <w:nsid w:val="00A99411"/>
-    <w:multiLevelType w:val="multilevel"/>
-    <w:lvl w:ilvl="0">
-      <w:start w:val="1"/>
-      <w:numFmt w:val="decimal"/>
-      <w:lvlText w:val="%1."/>
-      <w:lvlJc w:val="left"/>
-      <w:pPr>
-        <w:ind w:left="720" w:hanging="360"/>
-      </w:pPr>
-    </w:lvl>
-    <w:lvl w:ilvl="1">
-      <w:start w:val="1"/>
-      <w:numFmt w:val="decimal"/>
-      <w:lvlText w:val="%2."/>
-      <w:lvlJc w:val="left"/>
-      <w:pPr>
-        <w:ind w:left="1440" w:hanging="360"/>
-      </w:pPr>
-    </w:lvl>
-    <w:lvl w:ilvl="2">
-      <w:start w:val="1"/>
-      <w:numFmt w:val="decimal"/>
-      <w:lvlText w:val="%3."/>
-      <w:lvlJc w:val="left"/>
-      <w:pPr>
-        <w:ind w:left="2160" w:hanging="360"/>
-      </w:pPr>
-    </w:lvl>
-    <w:lvl w:ilvl="3">
-      <w:start w:val="1"/>
-      <w:numFmt w:val="decimal"/>
-      <w:lvlText w:val="%4."/>
-      <w:lvlJc w:val="left"/>
-      <w:pPr>
-        <w:ind w:left="2880" w:hanging="360"/>
-      </w:pPr>
-    </w:lvl>
-    <w:lvl w:ilvl="4">
-      <w:start w:val="1"/>
-      <w:numFmt w:val="decimal"/>
-      <w:lvlText w:val="%5."/>
-      <w:lvlJc w:val="left"/>
-      <w:pPr>
-        <w:ind w:left="3600" w:hanging="360"/>
-      </w:pPr>
-    </w:lvl>
-    <w:lvl w:ilvl="5">
-      <w:start w:val="1"/>
-      <w:numFmt w:val="decimal"/>
-      <w:lvlText w:val="%6."/>
-      <w:lvlJc w:val="left"/>
-      <w:pPr>
-        <w:ind w:left="4320" w:hanging="360"/>
-      </w:pPr>
-    </w:lvl>
-    <w:lvl w:ilvl="6">
-      <w:start w:val="1"/>
-      <w:numFmt w:val="decimal"/>
-      <w:lvlText w:val="%7."/>
-      <w:lvlJc w:val="left"/>
-      <w:pPr>
-        <w:ind w:left="5040" w:hanging="360"/>
-      </w:pPr>
-    </w:lvl>
-    <w:lvl w:ilvl="7">
-      <w:start w:val="1"/>
-      <w:numFmt w:val="decimal"/>
-      <w:lvlText w:val="%8."/>
-      <w:lvlJc w:val="left"/>
-      <w:pPr>
-        <w:ind w:left="5760" w:hanging="360"/>
-      </w:pPr>
-    </w:lvl>
-    <w:lvl w:ilvl="8">
-      <w:start w:val="1"/>
-      <w:numFmt w:val="decimal"/>
-      <w:lvlText w:val="%9."/>
-      <w:lvlJc w:val="left"/>
-      <w:pPr>
-        <w:ind w:left="6480" w:hanging="360"/>
-      </w:pPr>
-    </w:lvl>
-  </w:abstractNum>
   <w:num w:numId="1000">
     <w:abstractNumId w:val="990"/>
-  </w:num>
-  <w:num w:numId="1001">
-    <w:abstractNumId w:val="991"/>
-  </w:num>
-  <w:num w:numId="1002">
-    <w:abstractNumId w:val="99411"/>
-    <w:lvlOverride w:ilvl="0">
-      <w:startOverride w:val="1"/>
-    </w:lvlOverride>
-    <w:lvlOverride w:ilvl="1">
-      <w:startOverride w:val="1"/>
-    </w:lvlOverride>
-    <w:lvlOverride w:ilvl="2">
-      <w:startOverride w:val="1"/>
-    </w:lvlOverride>
-    <w:lvlOverride w:ilvl="3">
-      <w:startOverride w:val="1"/>
-    </w:lvlOverride>
-    <w:lvlOverride w:ilvl="4">
-      <w:startOverride w:val="1"/>
-    </w:lvlOverride>
-    <w:lvlOverride w:ilvl="5">
-      <w:startOverride w:val="1"/>
-    </w:lvlOverride>
-    <w:lvlOverride w:ilvl="6">
-      <w:startOverride w:val="1"/>
-    </w:lvlOverride>
-    <w:lvlOverride w:ilvl="7">
-      <w:startOverride w:val="1"/>
-    </w:lvlOverride>
-    <w:lvlOverride w:ilvl="8">
-      <w:startOverride w:val="1"/>
-    </w:lvlOverride>
-  </w:num>
-  <w:num w:numId="1003">
-    <w:abstractNumId w:val="99411"/>
-    <w:lvlOverride w:ilvl="0">
-      <w:startOverride w:val="1"/>
-    </w:lvlOverride>
-    <w:lvlOverride w:ilvl="1">
-      <w:startOverride w:val="1"/>
-    </w:lvlOverride>
-    <w:lvlOverride w:ilvl="2">
-      <w:startOverride w:val="1"/>
-    </w:lvlOverride>
-    <w:lvlOverride w:ilvl="3">
-      <w:startOverride w:val="1"/>
-    </w:lvlOverride>
-    <w:lvlOverride w:ilvl="4">
-      <w:startOverride w:val="1"/>
-    </w:lvlOverride>
-    <w:lvlOverride w:ilvl="5">
-      <w:startOverride w:val="1"/>
-    </w:lvlOverride>
-    <w:lvlOverride w:ilvl="6">
-      <w:startOverride w:val="1"/>
-    </w:lvlOverride>
-    <w:lvlOverride w:ilvl="7">
-      <w:startOverride w:val="1"/>
-    </w:lvlOverride>
-    <w:lvlOverride w:ilvl="8">
-      <w:startOverride w:val="1"/>
-    </w:lvlOverride>
   </w:num>
 </w:numbering>
 </file>

</xml_diff>

<commit_message>
Deploying to gh-pages from @ Morrison-Lab/sds@ef9dd46b0e940b565b5fe08ca5fe417a362a785d 🚀
</commit_message>
<xml_diff>
--- a/index.docx
+++ b/index.docx
@@ -15,16 +15,7 @@
         <w:pStyle w:val="Date"/>
       </w:pPr>
       <w:r>
-        <w:t xml:space="preserve">Last modified: 2026-09-28 01:04:30 (PDT)</w:t>
-      </w:r>
-    </w:p>
-    <w:bookmarkStart w:id="10" w:name="welcome"/>
-    <w:p>
-      <w:pPr>
-        <w:pStyle w:val="Heading1"/>
-      </w:pPr>
-      <w:r>
-        <w:t xml:space="preserve">Welcome</w:t>
+        <w:t xml:space="preserve">Last modified: 2026-09-28 02:56:03 (PDT)</w:t>
       </w:r>
     </w:p>
     <w:p>
@@ -35,13 +26,881 @@
         <w:t xml:space="preserve">These notes collect the statistics that data science courses assume.</w:t>
       </w:r>
     </w:p>
-    <w:bookmarkStart w:id="9" w:name="using-these-notes-in-another-site"/>
+    <w:bookmarkStart w:id="21" w:name="topics"/>
     <w:p>
       <w:pPr>
         <w:pStyle w:val="Heading2"/>
       </w:pPr>
       <w:r>
-        <w:t xml:space="preserve">0.1 Using these notes in another site</w:t>
+        <w:t xml:space="preserve">1 Topics</w:t>
+      </w:r>
+    </w:p>
+    <w:p>
+      <w:pPr>
+        <w:pStyle w:val="FirstParagraph"/>
+      </w:pPr>
+      <w:r>
+        <w:t xml:space="preserve">The notes are organized in four groups of pages.</w:t>
+      </w:r>
+    </w:p>
+    <w:p>
+      <w:pPr>
+        <w:pStyle w:val="BodyText"/>
+      </w:pPr>
+      <w:r>
+        <w:t xml:space="preserve">Describing data:</w:t>
+      </w:r>
+    </w:p>
+    <w:p>
+      <w:pPr>
+        <w:pStyle w:val="Compact"/>
+        <w:numPr>
+          <w:ilvl w:val="0"/>
+          <w:numId w:val="1001"/>
+        </w:numPr>
+      </w:pPr>
+      <w:hyperlink r:id="rId9">
+        <w:r>
+          <w:rPr>
+            <w:rStyle w:val="Hyperlink"/>
+          </w:rPr>
+          <w:t xml:space="preserve">Nonparametric models</w:t>
+        </w:r>
+      </w:hyperlink>
+      <w:r>
+        <w:t xml:space="preserve">:</w:t>
+      </w:r>
+      <w:r>
+        <w:t xml:space="preserve"> </w:t>
+      </w:r>
+      <w:r>
+        <w:t xml:space="preserve">the empirical CDF, order statistics, and sample quantiles;</w:t>
+      </w:r>
+    </w:p>
+    <w:p>
+      <w:pPr>
+        <w:pStyle w:val="Compact"/>
+        <w:numPr>
+          <w:ilvl w:val="0"/>
+          <w:numId w:val="1001"/>
+        </w:numPr>
+      </w:pPr>
+      <w:hyperlink r:id="rId10">
+        <w:r>
+          <w:rPr>
+            <w:rStyle w:val="Hyperlink"/>
+          </w:rPr>
+          <w:t xml:space="preserve">Exploratory data analysis</w:t>
+        </w:r>
+      </w:hyperlink>
+      <w:r>
+        <w:t xml:space="preserve">:</w:t>
+      </w:r>
+      <w:r>
+        <w:t xml:space="preserve"> </w:t>
+      </w:r>
+      <w:r>
+        <w:t xml:space="preserve">sample statistics, graphs, correlation, and contingency tables,</w:t>
+      </w:r>
+      <w:r>
+        <w:t xml:space="preserve"> </w:t>
+      </w:r>
+      <w:r>
+        <w:t xml:space="preserve">illustrated with the WCGS data.</w:t>
+      </w:r>
+    </w:p>
+    <w:p>
+      <w:pPr>
+        <w:pStyle w:val="FirstParagraph"/>
+      </w:pPr>
+      <w:r>
+        <w:t xml:space="preserve">Inference:</w:t>
+      </w:r>
+    </w:p>
+    <w:p>
+      <w:pPr>
+        <w:pStyle w:val="Compact"/>
+        <w:numPr>
+          <w:ilvl w:val="0"/>
+          <w:numId w:val="1002"/>
+        </w:numPr>
+      </w:pPr>
+      <w:hyperlink r:id="rId11">
+        <w:r>
+          <w:rPr>
+            <w:rStyle w:val="Hyperlink"/>
+          </w:rPr>
+          <w:t xml:space="preserve">Estimation</w:t>
+        </w:r>
+      </w:hyperlink>
+      <w:r>
+        <w:t xml:space="preserve">:</w:t>
+      </w:r>
+      <w:r>
+        <w:t xml:space="preserve"> </w:t>
+      </w:r>
+      <w:r>
+        <w:t xml:space="preserve">estimands, estimators, bias, mean squared error, and standard error;</w:t>
+      </w:r>
+    </w:p>
+    <w:p>
+      <w:pPr>
+        <w:pStyle w:val="Compact"/>
+        <w:numPr>
+          <w:ilvl w:val="0"/>
+          <w:numId w:val="1002"/>
+        </w:numPr>
+      </w:pPr>
+      <w:hyperlink r:id="rId12">
+        <w:r>
+          <w:rPr>
+            <w:rStyle w:val="Hyperlink"/>
+          </w:rPr>
+          <w:t xml:space="preserve">Statistical inference</w:t>
+        </w:r>
+      </w:hyperlink>
+      <w:r>
+        <w:t xml:space="preserve">:</w:t>
+      </w:r>
+      <w:r>
+        <w:t xml:space="preserve"> </w:t>
+      </w:r>
+      <w:r>
+        <w:t xml:space="preserve">hypothesis tests, p-values, the</w:t>
+      </w:r>
+      <w:r>
+        <w:t xml:space="preserve"> </w:t>
+      </w:r>
+      <m:oMath>
+        <m:r>
+          <m:t>t</m:t>
+        </m:r>
+      </m:oMath>
+      <w:r>
+        <w:t xml:space="preserve">, chi-square, and</w:t>
+      </w:r>
+      <w:r>
+        <w:t xml:space="preserve"> </w:t>
+      </w:r>
+      <m:oMath>
+        <m:r>
+          <m:t>F</m:t>
+        </m:r>
+      </m:oMath>
+      <w:r>
+        <w:t xml:space="preserve"> </w:t>
+      </w:r>
+      <w:r>
+        <w:t xml:space="preserve">distributions,</w:t>
+      </w:r>
+      <w:r>
+        <w:t xml:space="preserve"> </w:t>
+      </w:r>
+      <w:r>
+        <w:t xml:space="preserve">confidence intervals, and how to interpret negative findings;</w:t>
+      </w:r>
+    </w:p>
+    <w:p>
+      <w:pPr>
+        <w:pStyle w:val="Compact"/>
+        <w:numPr>
+          <w:ilvl w:val="0"/>
+          <w:numId w:val="1002"/>
+        </w:numPr>
+      </w:pPr>
+      <w:hyperlink r:id="rId13">
+        <w:r>
+          <w:rPr>
+            <w:rStyle w:val="Hyperlink"/>
+          </w:rPr>
+          <w:t xml:space="preserve">Maximum likelihood inference</w:t>
+        </w:r>
+      </w:hyperlink>
+      <w:r>
+        <w:t xml:space="preserve">:</w:t>
+      </w:r>
+      <w:r>
+        <w:t xml:space="preserve"> </w:t>
+      </w:r>
+      <w:r>
+        <w:t xml:space="preserve">likelihood, score, information, the asymptotic distribution of MLEs,</w:t>
+      </w:r>
+      <w:r>
+        <w:t xml:space="preserve"> </w:t>
+      </w:r>
+      <w:r>
+        <w:t xml:space="preserve">Wald and likelihood ratio tests, and Newton-Raphson,</w:t>
+      </w:r>
+      <w:r>
+        <w:t xml:space="preserve"> </w:t>
+      </w:r>
+      <w:r>
+        <w:t xml:space="preserve">with worked examples.</w:t>
+      </w:r>
+    </w:p>
+    <w:p>
+      <w:pPr>
+        <w:pStyle w:val="FirstParagraph"/>
+      </w:pPr>
+      <w:r>
+        <w:t xml:space="preserve">Methods, illustrated with the HERS data:</w:t>
+      </w:r>
+    </w:p>
+    <w:p>
+      <w:pPr>
+        <w:pStyle w:val="Compact"/>
+        <w:numPr>
+          <w:ilvl w:val="0"/>
+          <w:numId w:val="1003"/>
+        </w:numPr>
+      </w:pPr>
+      <w:hyperlink r:id="rId14">
+        <w:r>
+          <w:rPr>
+            <w:rStyle w:val="Hyperlink"/>
+          </w:rPr>
+          <w:t xml:space="preserve">Comparing means</w:t>
+        </w:r>
+      </w:hyperlink>
+      <w:r>
+        <w:t xml:space="preserve">:</w:t>
+      </w:r>
+      <w:r>
+        <w:t xml:space="preserve"> </w:t>
+      </w:r>
+      <w:r>
+        <w:t xml:space="preserve">t-tests and one-way ANOVA;</w:t>
+      </w:r>
+    </w:p>
+    <w:p>
+      <w:pPr>
+        <w:pStyle w:val="Compact"/>
+        <w:numPr>
+          <w:ilvl w:val="0"/>
+          <w:numId w:val="1003"/>
+        </w:numPr>
+      </w:pPr>
+      <w:hyperlink r:id="rId15">
+        <w:r>
+          <w:rPr>
+            <w:rStyle w:val="Hyperlink"/>
+          </w:rPr>
+          <w:t xml:space="preserve">Comparing proportions</w:t>
+        </w:r>
+      </w:hyperlink>
+      <w:r>
+        <w:t xml:space="preserve">:</w:t>
+      </w:r>
+      <w:r>
+        <w:t xml:space="preserve"> </w:t>
+      </w:r>
+      <w:r>
+        <w:t xml:space="preserve">the chi-square test and Fisher’s exact test;</w:t>
+      </w:r>
+    </w:p>
+    <w:p>
+      <w:pPr>
+        <w:pStyle w:val="Compact"/>
+        <w:numPr>
+          <w:ilvl w:val="0"/>
+          <w:numId w:val="1003"/>
+        </w:numPr>
+      </w:pPr>
+      <w:hyperlink r:id="rId16">
+        <w:r>
+          <w:rPr>
+            <w:rStyle w:val="Hyperlink"/>
+          </w:rPr>
+          <w:t xml:space="preserve">Correlation and simple linear regression</w:t>
+        </w:r>
+      </w:hyperlink>
+      <w:r>
+        <w:t xml:space="preserve">;</w:t>
+      </w:r>
+    </w:p>
+    <w:p>
+      <w:pPr>
+        <w:pStyle w:val="Compact"/>
+        <w:numPr>
+          <w:ilvl w:val="0"/>
+          <w:numId w:val="1003"/>
+        </w:numPr>
+      </w:pPr>
+      <w:hyperlink r:id="rId17">
+        <w:r>
+          <w:rPr>
+            <w:rStyle w:val="Hyperlink"/>
+          </w:rPr>
+          <w:t xml:space="preserve">The bootstrap</w:t>
+        </w:r>
+      </w:hyperlink>
+      <w:r>
+        <w:t xml:space="preserve">.</w:t>
+      </w:r>
+    </w:p>
+    <w:p>
+      <w:pPr>
+        <w:pStyle w:val="FirstParagraph"/>
+      </w:pPr>
+      <w:r>
+        <w:t xml:space="preserve">Bayesian:</w:t>
+      </w:r>
+    </w:p>
+    <w:p>
+      <w:pPr>
+        <w:pStyle w:val="Compact"/>
+        <w:numPr>
+          <w:ilvl w:val="0"/>
+          <w:numId w:val="1004"/>
+        </w:numPr>
+      </w:pPr>
+      <w:hyperlink r:id="rId18">
+        <w:r>
+          <w:rPr>
+            <w:rStyle w:val="Hyperlink"/>
+          </w:rPr>
+          <w:t xml:space="preserve">Bayesian inference</w:t>
+        </w:r>
+      </w:hyperlink>
+      <w:r>
+        <w:t xml:space="preserve">:</w:t>
+      </w:r>
+      <w:r>
+        <w:t xml:space="preserve"> </w:t>
+      </w:r>
+      <w:r>
+        <w:t xml:space="preserve">the Bayesian paradigm, priors, posteriors, and hierarchical models;</w:t>
+      </w:r>
+    </w:p>
+    <w:p>
+      <w:pPr>
+        <w:pStyle w:val="Compact"/>
+        <w:numPr>
+          <w:ilvl w:val="0"/>
+          <w:numId w:val="1004"/>
+        </w:numPr>
+      </w:pPr>
+      <w:hyperlink r:id="rId19">
+        <w:r>
+          <w:rPr>
+            <w:rStyle w:val="Hyperlink"/>
+          </w:rPr>
+          <w:t xml:space="preserve">Markov chain Monte Carlo</w:t>
+        </w:r>
+      </w:hyperlink>
+      <w:r>
+        <w:t xml:space="preserve">:</w:t>
+      </w:r>
+      <w:r>
+        <w:t xml:space="preserve"> </w:t>
+      </w:r>
+      <w:r>
+        <w:t xml:space="preserve">Monte Carlo integration, the Metropolis–Hastings and Gibbs samplers,</w:t>
+      </w:r>
+      <w:r>
+        <w:t xml:space="preserve"> </w:t>
+      </w:r>
+      <w:r>
+        <w:t xml:space="preserve">convergence diagnostics, and the deviance information criterion;</w:t>
+      </w:r>
+    </w:p>
+    <w:p>
+      <w:pPr>
+        <w:pStyle w:val="Compact"/>
+        <w:numPr>
+          <w:ilvl w:val="0"/>
+          <w:numId w:val="1004"/>
+        </w:numPr>
+      </w:pPr>
+      <w:hyperlink r:id="rId20">
+        <w:r>
+          <w:rPr>
+            <w:rStyle w:val="Hyperlink"/>
+          </w:rPr>
+          <w:t xml:space="preserve">Fitting models by Bayesian inference with JAGS</w:t>
+        </w:r>
+      </w:hyperlink>
+      <w:r>
+        <w:t xml:space="preserve">:</w:t>
+      </w:r>
+      <w:r>
+        <w:t xml:space="preserve"> </w:t>
+      </w:r>
+      <w:r>
+        <w:t xml:space="preserve">a proportion, logistic regression, survival, random effects,</w:t>
+      </w:r>
+      <w:r>
+        <w:t xml:space="preserve"> </w:t>
+      </w:r>
+      <w:r>
+        <w:t xml:space="preserve">and Bayesian model averaging.</w:t>
+      </w:r>
+    </w:p>
+    <w:bookmarkEnd w:id="21"/>
+    <w:bookmarkStart w:id="25" w:name="origin"/>
+    <w:p>
+      <w:pPr>
+        <w:pStyle w:val="Heading2"/>
+      </w:pPr>
+      <w:r>
+        <w:t xml:space="preserve">2 Origin</w:t>
+      </w:r>
+    </w:p>
+    <w:p>
+      <w:pPr>
+        <w:pStyle w:val="FirstParagraph"/>
+      </w:pPr>
+      <w:r>
+        <w:t xml:space="preserve">These notes began as the statistics appendices of</w:t>
+      </w:r>
+      <w:r>
+        <w:t xml:space="preserve"> </w:t>
+      </w:r>
+      <w:hyperlink r:id="rId22">
+        <w:r>
+          <w:rPr>
+            <w:rStyle w:val="Hyperlink"/>
+            <w:i/>
+            <w:iCs/>
+          </w:rPr>
+          <w:t xml:space="preserve">Regression Models for Epidemiology</w:t>
+        </w:r>
+      </w:hyperlink>
+      <w:r>
+        <w:t xml:space="preserve">,</w:t>
+      </w:r>
+      <w:r>
+        <w:t xml:space="preserve"> </w:t>
+      </w:r>
+      <w:r>
+        <w:t xml:space="preserve">and keep those chapters’ file names,</w:t>
+      </w:r>
+      <w:r>
+        <w:t xml:space="preserve"> </w:t>
+      </w:r>
+      <w:r>
+        <w:t xml:space="preserve">except that two long chapters are now split into several pages.</w:t>
+      </w:r>
+      <w:r>
+        <w:t xml:space="preserve"> </w:t>
+      </w:r>
+      <w:r>
+        <w:t xml:space="preserve">Most results keep their rme</w:t>
+      </w:r>
+      <w:r>
+        <w:t xml:space="preserve"> </w:t>
+      </w:r>
+      <w:r>
+        <w:rPr>
+          <w:rStyle w:val="VerbatimChar"/>
+        </w:rPr>
+        <w:t xml:space="preserve">#id</w:t>
+      </w:r>
+      <w:r>
+        <w:t xml:space="preserve"> </w:t>
+      </w:r>
+      <w:r>
+        <w:t xml:space="preserve">anchors on the same page;</w:t>
+      </w:r>
+      <w:r>
+        <w:t xml:space="preserve"> </w:t>
+      </w:r>
+      <w:r>
+        <w:t xml:space="preserve">the exceptions are:</w:t>
+      </w:r>
+    </w:p>
+    <w:p>
+      <w:pPr>
+        <w:pStyle w:val="Compact"/>
+        <w:numPr>
+          <w:ilvl w:val="0"/>
+          <w:numId w:val="1005"/>
+        </w:numPr>
+      </w:pPr>
+      <w:r>
+        <w:t xml:space="preserve">the maximum likelihood practice exercises (</w:t>
+      </w:r>
+      <w:r>
+        <w:rPr>
+          <w:rStyle w:val="VerbatimChar"/>
+        </w:rPr>
+        <w:t xml:space="preserve">exr-prac-*</w:t>
+      </w:r>
+      <w:r>
+        <w:t xml:space="preserve">),</w:t>
+      </w:r>
+      <w:r>
+        <w:t xml:space="preserve"> </w:t>
+      </w:r>
+      <w:r>
+        <w:t xml:space="preserve">which moved from the estimation page to the maximum likelihood page;</w:t>
+      </w:r>
+    </w:p>
+    <w:p>
+      <w:pPr>
+        <w:pStyle w:val="Compact"/>
+        <w:numPr>
+          <w:ilvl w:val="0"/>
+          <w:numId w:val="1005"/>
+        </w:numPr>
+      </w:pPr>
+      <w:r>
+        <w:t xml:space="preserve">the null and alternative hypothesis definitions,</w:t>
+      </w:r>
+      <w:r>
+        <w:t xml:space="preserve"> </w:t>
+      </w:r>
+      <w:r>
+        <w:t xml:space="preserve">which moved from basic statistical methods to statistical inference;</w:t>
+      </w:r>
+    </w:p>
+    <w:p>
+      <w:pPr>
+        <w:pStyle w:val="Compact"/>
+        <w:numPr>
+          <w:ilvl w:val="0"/>
+          <w:numId w:val="1005"/>
+        </w:numPr>
+      </w:pPr>
+      <w:r>
+        <w:t xml:space="preserve">the sample statistics (mean, median, variance, standard deviation,</w:t>
+      </w:r>
+      <w:r>
+        <w:t xml:space="preserve"> </w:t>
+      </w:r>
+      <w:r>
+        <w:t xml:space="preserve">interquartile range, proportion, correlation) and the contingency table,</w:t>
+      </w:r>
+      <w:r>
+        <w:t xml:space="preserve"> </w:t>
+      </w:r>
+      <w:r>
+        <w:t xml:space="preserve">which rme defined on two pages;</w:t>
+      </w:r>
+      <w:r>
+        <w:t xml:space="preserve"> </w:t>
+      </w:r>
+      <w:r>
+        <w:t xml:space="preserve">they are now defined once, on the exploratory data analysis page,</w:t>
+      </w:r>
+      <w:r>
+        <w:t xml:space="preserve"> </w:t>
+      </w:r>
+      <w:r>
+        <w:t xml:space="preserve">under the ids rme used on its basic statistical methods page</w:t>
+      </w:r>
+      <w:r>
+        <w:t xml:space="preserve"> </w:t>
+      </w:r>
+      <w:r>
+        <w:t xml:space="preserve">(such as</w:t>
+      </w:r>
+      <w:r>
+        <w:t xml:space="preserve"> </w:t>
+      </w:r>
+      <w:r>
+        <w:rPr>
+          <w:rStyle w:val="VerbatimChar"/>
+        </w:rPr>
+        <w:t xml:space="preserve">def-sample-mean</w:t>
+      </w:r>
+      <w:r>
+        <w:t xml:space="preserve">),</w:t>
+      </w:r>
+      <w:r>
+        <w:t xml:space="preserve"> </w:t>
+      </w:r>
+      <w:r>
+        <w:t xml:space="preserve">so the exploratory-descriptive ids from rme</w:t>
+      </w:r>
+      <w:r>
+        <w:t xml:space="preserve"> </w:t>
+      </w:r>
+      <w:r>
+        <w:rPr>
+          <w:rStyle w:val="VerbatimChar"/>
+        </w:rPr>
+        <w:t xml:space="preserve">def-mean</w:t>
+      </w:r>
+      <w:r>
+        <w:t xml:space="preserve">,</w:t>
+      </w:r>
+      <w:r>
+        <w:t xml:space="preserve"> </w:t>
+      </w:r>
+      <w:r>
+        <w:rPr>
+          <w:rStyle w:val="VerbatimChar"/>
+        </w:rPr>
+        <w:t xml:space="preserve">def-median</w:t>
+      </w:r>
+      <w:r>
+        <w:t xml:space="preserve">,</w:t>
+      </w:r>
+      <w:r>
+        <w:t xml:space="preserve"> </w:t>
+      </w:r>
+      <w:r>
+        <w:rPr>
+          <w:rStyle w:val="VerbatimChar"/>
+        </w:rPr>
+        <w:t xml:space="preserve">def-eda-variance</w:t>
+      </w:r>
+      <w:r>
+        <w:t xml:space="preserve">,</w:t>
+      </w:r>
+      <w:r>
+        <w:t xml:space="preserve"> </w:t>
+      </w:r>
+      <w:r>
+        <w:rPr>
+          <w:rStyle w:val="VerbatimChar"/>
+        </w:rPr>
+        <w:t xml:space="preserve">def-eda-sd</w:t>
+      </w:r>
+      <w:r>
+        <w:t xml:space="preserve">,</w:t>
+      </w:r>
+      <w:r>
+        <w:t xml:space="preserve"> </w:t>
+      </w:r>
+      <w:r>
+        <w:rPr>
+          <w:rStyle w:val="VerbatimChar"/>
+        </w:rPr>
+        <w:t xml:space="preserve">def-quantile</w:t>
+      </w:r>
+      <w:r>
+        <w:t xml:space="preserve">,</w:t>
+      </w:r>
+      <w:r>
+        <w:t xml:space="preserve"> </w:t>
+      </w:r>
+      <w:r>
+        <w:rPr>
+          <w:rStyle w:val="VerbatimChar"/>
+        </w:rPr>
+        <w:t xml:space="preserve">def-iqr</w:t>
+      </w:r>
+      <w:r>
+        <w:t xml:space="preserve">, and</w:t>
+      </w:r>
+      <w:r>
+        <w:t xml:space="preserve"> </w:t>
+      </w:r>
+      <w:r>
+        <w:rPr>
+          <w:rStyle w:val="VerbatimChar"/>
+        </w:rPr>
+        <w:t xml:space="preserve">def-correlation</w:t>
+      </w:r>
+      <w:r>
+        <w:t xml:space="preserve"> </w:t>
+      </w:r>
+      <w:r>
+        <w:t xml:space="preserve">are retired;</w:t>
+      </w:r>
+    </w:p>
+    <w:p>
+      <w:pPr>
+        <w:pStyle w:val="Compact"/>
+        <w:numPr>
+          <w:ilvl w:val="0"/>
+          <w:numId w:val="1005"/>
+        </w:numPr>
+      </w:pPr>
+      <w:r>
+        <w:t xml:space="preserve">the basic statistical methods sections on categorical outcomes,</w:t>
+      </w:r>
+      <w:r>
+        <w:t xml:space="preserve"> </w:t>
+      </w:r>
+      <w:r>
+        <w:t xml:space="preserve">correlation and simple linear regression, and the bootstrap</w:t>
+      </w:r>
+      <w:r>
+        <w:t xml:space="preserve"> </w:t>
+      </w:r>
+      <w:r>
+        <w:t xml:space="preserve">(such as</w:t>
+      </w:r>
+      <w:r>
+        <w:t xml:space="preserve"> </w:t>
+      </w:r>
+      <w:r>
+        <w:rPr>
+          <w:rStyle w:val="VerbatimChar"/>
+        </w:rPr>
+        <w:t xml:space="preserve">sec-two-group-categorical</w:t>
+      </w:r>
+      <w:r>
+        <w:t xml:space="preserve">,</w:t>
+      </w:r>
+      <w:r>
+        <w:t xml:space="preserve"> </w:t>
+      </w:r>
+      <w:r>
+        <w:rPr>
+          <w:rStyle w:val="VerbatimChar"/>
+        </w:rPr>
+        <w:t xml:space="preserve">sec-correlation</w:t>
+      </w:r>
+      <w:r>
+        <w:t xml:space="preserve">,</w:t>
+      </w:r>
+      <w:r>
+        <w:t xml:space="preserve"> </w:t>
+      </w:r>
+      <w:r>
+        <w:rPr>
+          <w:rStyle w:val="VerbatimChar"/>
+        </w:rPr>
+        <w:t xml:space="preserve">sec-simple-linear-regression</w:t>
+      </w:r>
+      <w:r>
+        <w:t xml:space="preserve">, and</w:t>
+      </w:r>
+      <w:r>
+        <w:t xml:space="preserve"> </w:t>
+      </w:r>
+      <w:r>
+        <w:rPr>
+          <w:rStyle w:val="VerbatimChar"/>
+        </w:rPr>
+        <w:t xml:space="preserve">sec-bootstrap-ci</w:t>
+      </w:r>
+      <w:r>
+        <w:t xml:space="preserve">),</w:t>
+      </w:r>
+      <w:r>
+        <w:t xml:space="preserve"> </w:t>
+      </w:r>
+      <w:r>
+        <w:t xml:space="preserve">which moved to their own pages, with their ids;</w:t>
+      </w:r>
+    </w:p>
+    <w:p>
+      <w:pPr>
+        <w:pStyle w:val="Compact"/>
+        <w:numPr>
+          <w:ilvl w:val="0"/>
+          <w:numId w:val="1005"/>
+        </w:numPr>
+      </w:pPr>
+      <w:r>
+        <w:t xml:space="preserve">the Bayesian inference sections on computation</w:t>
+      </w:r>
+      <w:r>
+        <w:t xml:space="preserve"> </w:t>
+      </w:r>
+      <w:r>
+        <w:t xml:space="preserve">(</w:t>
+      </w:r>
+      <w:r>
+        <w:rPr>
+          <w:rStyle w:val="VerbatimChar"/>
+        </w:rPr>
+        <w:t xml:space="preserve">sec-foundations</w:t>
+      </w:r>
+      <w:r>
+        <w:t xml:space="preserve"> </w:t>
+      </w:r>
+      <w:r>
+        <w:t xml:space="preserve">through</w:t>
+      </w:r>
+      <w:r>
+        <w:t xml:space="preserve"> </w:t>
+      </w:r>
+      <w:r>
+        <w:rPr>
+          <w:rStyle w:val="VerbatimChar"/>
+        </w:rPr>
+        <w:t xml:space="preserve">sec-dic</w:t>
+      </w:r>
+      <w:r>
+        <w:t xml:space="preserve">)</w:t>
+      </w:r>
+      <w:r>
+        <w:t xml:space="preserve"> </w:t>
+      </w:r>
+      <w:r>
+        <w:t xml:space="preserve">and the worked examples (</w:t>
+      </w:r>
+      <w:r>
+        <w:rPr>
+          <w:rStyle w:val="VerbatimChar"/>
+        </w:rPr>
+        <w:t xml:space="preserve">sec-bayes-examples</w:t>
+      </w:r>
+      <w:r>
+        <w:t xml:space="preserve"> </w:t>
+      </w:r>
+      <w:r>
+        <w:t xml:space="preserve">and the sections after it),</w:t>
+      </w:r>
+      <w:r>
+        <w:t xml:space="preserve"> </w:t>
+      </w:r>
+      <w:r>
+        <w:t xml:space="preserve">which moved to the MCMC and JAGS pages, with their ids.</w:t>
+      </w:r>
+    </w:p>
+    <w:p>
+      <w:pPr>
+        <w:pStyle w:val="FirstParagraph"/>
+      </w:pPr>
+      <w:r>
+        <w:t xml:space="preserve">Where these notes rely on probability or calculus,</w:t>
+      </w:r>
+      <w:r>
+        <w:t xml:space="preserve"> </w:t>
+      </w:r>
+      <w:r>
+        <w:t xml:space="preserve">they link to that book’s</w:t>
+      </w:r>
+      <w:r>
+        <w:t xml:space="preserve"> </w:t>
+      </w:r>
+      <w:hyperlink r:id="rId23">
+        <w:r>
+          <w:rPr>
+            <w:rStyle w:val="Hyperlink"/>
+          </w:rPr>
+          <w:t xml:space="preserve">probability</w:t>
+        </w:r>
+      </w:hyperlink>
+      <w:r>
+        <w:t xml:space="preserve"> </w:t>
+      </w:r>
+      <w:r>
+        <w:t xml:space="preserve">and</w:t>
+      </w:r>
+      <w:r>
+        <w:t xml:space="preserve"> </w:t>
+      </w:r>
+      <w:hyperlink r:id="rId24">
+        <w:r>
+          <w:rPr>
+            <w:rStyle w:val="Hyperlink"/>
+          </w:rPr>
+          <w:t xml:space="preserve">mathematics</w:t>
+        </w:r>
+      </w:hyperlink>
+      <w:r>
+        <w:t xml:space="preserve"> </w:t>
+      </w:r>
+      <w:r>
+        <w:t xml:space="preserve">chapters.</w:t>
+      </w:r>
+    </w:p>
+    <w:bookmarkEnd w:id="25"/>
+    <w:bookmarkStart w:id="26" w:name="using-these-notes-in-another-site"/>
+    <w:p>
+      <w:pPr>
+        <w:pStyle w:val="Heading2"/>
+      </w:pPr>
+      <w:r>
+        <w:t xml:space="preserve">3 Using these notes in another site</w:t>
       </w:r>
     </w:p>
     <w:p>
@@ -82,7 +941,52 @@
         <w:t xml:space="preserve">sds/</w:t>
       </w:r>
       <w:r>
+        <w:t xml:space="preserve">,</w:t>
+      </w:r>
+      <w:r>
+        <w:t xml:space="preserve"> </w:t>
+      </w:r>
+      <w:r>
+        <w:t xml:space="preserve">for example</w:t>
+      </w:r>
+      <w:r>
+        <w:t xml:space="preserve"> </w:t>
+      </w:r>
+      <w:r>
+        <w:rPr>
+          <w:rStyle w:val="VerbatimChar"/>
+        </w:rPr>
+        <w:t xml:space="preserve">{{&lt; include sds/_subfiles/intro-MLEs/_def_mle.qmd &gt;}}</w:t>
+      </w:r>
+      <w:r>
         <w:t xml:space="preserve">.</w:t>
+      </w:r>
+      <w:r>
+        <w:t xml:space="preserve"> </w:t>
+      </w:r>
+      <w:r>
+        <w:t xml:space="preserve">This site includes its own fragments the same way,</w:t>
+      </w:r>
+      <w:r>
+        <w:t xml:space="preserve"> </w:t>
+      </w:r>
+      <w:r>
+        <w:t xml:space="preserve">through an</w:t>
+      </w:r>
+      <w:r>
+        <w:t xml:space="preserve"> </w:t>
+      </w:r>
+      <w:r>
+        <w:rPr>
+          <w:rStyle w:val="VerbatimChar"/>
+        </w:rPr>
+        <w:t xml:space="preserve">sds</w:t>
+      </w:r>
+      <w:r>
+        <w:t xml:space="preserve"> </w:t>
+      </w:r>
+      <w:r>
+        <w:t xml:space="preserve">symlink that points at the repository root.</w:t>
       </w:r>
     </w:p>
     <w:p>
@@ -117,11 +1021,22 @@
         <w:t xml:space="preserve"> </w:t>
       </w:r>
       <w:r>
-        <w:t xml:space="preserve">uses an explicit link to the page and anchor.</w:t>
-      </w:r>
-    </w:p>
-    <w:bookmarkEnd w:id="9"/>
-    <w:bookmarkEnd w:id="10"/>
+        <w:t xml:space="preserve">uses an explicit link, such as</w:t>
+      </w:r>
+      <w:r>
+        <w:t xml:space="preserve"> </w:t>
+      </w:r>
+      <w:r>
+        <w:rPr>
+          <w:rStyle w:val="VerbatimChar"/>
+        </w:rPr>
+        <w:t xml:space="preserve">[text](estimation.qmd#def-bias)</w:t>
+      </w:r>
+      <w:r>
+        <w:t xml:space="preserve">.</w:t>
+      </w:r>
+    </w:p>
+    <w:bookmarkEnd w:id="26"/>
     <w:sectPr>
       <w:footnotePr>
         <w:numRestart w:val="eachSect"/>
@@ -232,8 +1147,126 @@
       </w:pPr>
     </w:lvl>
   </w:abstractNum>
+  <w:abstractNum w:abstractNumId="991">
+    <w:nsid w:val="0000A991"/>
+    <w:multiLevelType w:val="multilevel"/>
+    <w:lvl w:ilvl="0">
+      <w:numFmt w:val="bullet"/>
+      <w:lvlText w:val=""/>
+      <w:lvlJc w:val="left"/>
+      <w:pPr>
+        <w:ind w:left="720" w:hanging="360"/>
+      </w:pPr>
+      <w:rPr>
+        <w:rFonts w:ascii="Symbol" w:hAnsi="Symbol" w:cs="Symbol" w:hint="default"/>
+      </w:rPr>
+    </w:lvl>
+    <w:lvl w:ilvl="1">
+      <w:numFmt w:val="bullet"/>
+      <w:lvlText w:val="o"/>
+      <w:lvlJc w:val="left"/>
+      <w:pPr>
+        <w:ind w:left="1440" w:hanging="360"/>
+      </w:pPr>
+      <w:rPr>
+        <w:rFonts w:ascii="Courier New" w:hAnsi="Courier New" w:cs="Courier New" w:hint="default"/>
+      </w:rPr>
+    </w:lvl>
+    <w:lvl w:ilvl="2">
+      <w:numFmt w:val="bullet"/>
+      <w:lvlText w:val=""/>
+      <w:lvlJc w:val="left"/>
+      <w:pPr>
+        <w:ind w:left="2160" w:hanging="360"/>
+      </w:pPr>
+      <w:rPr>
+        <w:rFonts w:ascii="Wingdings" w:hAnsi="Wingdings" w:cs="Wingdings" w:hint="default"/>
+      </w:rPr>
+    </w:lvl>
+    <w:lvl w:ilvl="3">
+      <w:numFmt w:val="bullet"/>
+      <w:lvlText w:val=""/>
+      <w:lvlJc w:val="left"/>
+      <w:pPr>
+        <w:ind w:left="2880" w:hanging="360"/>
+      </w:pPr>
+      <w:rPr>
+        <w:rFonts w:ascii="Symbol" w:hAnsi="Symbol" w:cs="Symbol" w:hint="default"/>
+      </w:rPr>
+    </w:lvl>
+    <w:lvl w:ilvl="4">
+      <w:numFmt w:val="bullet"/>
+      <w:lvlText w:val="o"/>
+      <w:lvlJc w:val="left"/>
+      <w:pPr>
+        <w:ind w:left="3600" w:hanging="360"/>
+      </w:pPr>
+      <w:rPr>
+        <w:rFonts w:ascii="Courier New" w:hAnsi="Courier New" w:cs="Courier New" w:hint="default"/>
+      </w:rPr>
+    </w:lvl>
+    <w:lvl w:ilvl="5">
+      <w:numFmt w:val="bullet"/>
+      <w:lvlText w:val=""/>
+      <w:lvlJc w:val="left"/>
+      <w:pPr>
+        <w:ind w:left="4320" w:hanging="360"/>
+      </w:pPr>
+      <w:rPr>
+        <w:rFonts w:ascii="Wingdings" w:hAnsi="Wingdings" w:cs="Wingdings" w:hint="default"/>
+      </w:rPr>
+    </w:lvl>
+    <w:lvl w:ilvl="6">
+      <w:numFmt w:val="bullet"/>
+      <w:lvlText w:val=""/>
+      <w:lvlJc w:val="left"/>
+      <w:pPr>
+        <w:ind w:left="5040" w:hanging="360"/>
+      </w:pPr>
+      <w:rPr>
+        <w:rFonts w:ascii="Symbol" w:hAnsi="Symbol" w:cs="Symbol" w:hint="default"/>
+      </w:rPr>
+    </w:lvl>
+    <w:lvl w:ilvl="7">
+      <w:numFmt w:val="bullet"/>
+      <w:lvlText w:val="o"/>
+      <w:lvlJc w:val="left"/>
+      <w:pPr>
+        <w:ind w:left="5760" w:hanging="360"/>
+      </w:pPr>
+      <w:rPr>
+        <w:rFonts w:ascii="Courier New" w:hAnsi="Courier New" w:cs="Courier New" w:hint="default"/>
+      </w:rPr>
+    </w:lvl>
+    <w:lvl w:ilvl="8">
+      <w:numFmt w:val="bullet"/>
+      <w:lvlText w:val=""/>
+      <w:lvlJc w:val="left"/>
+      <w:pPr>
+        <w:ind w:left="6480" w:hanging="360"/>
+      </w:pPr>
+      <w:rPr>
+        <w:rFonts w:ascii="Wingdings" w:hAnsi="Wingdings" w:cs="Wingdings" w:hint="default"/>
+      </w:rPr>
+    </w:lvl>
+  </w:abstractNum>
   <w:num w:numId="1000">
     <w:abstractNumId w:val="990"/>
+  </w:num>
+  <w:num w:numId="1001">
+    <w:abstractNumId w:val="991"/>
+  </w:num>
+  <w:num w:numId="1002">
+    <w:abstractNumId w:val="991"/>
+  </w:num>
+  <w:num w:numId="1003">
+    <w:abstractNumId w:val="991"/>
+  </w:num>
+  <w:num w:numId="1004">
+    <w:abstractNumId w:val="991"/>
+  </w:num>
+  <w:num w:numId="1005">
+    <w:abstractNumId w:val="991"/>
   </w:num>
 </w:numbering>
 </file>

</xml_diff>

<commit_message>
Deploying to gh-pages from @ Morrison-Lab/sds@ba1260bb40153f84623e5d2645bf56a924f6f973 🚀
</commit_message>
<xml_diff>
--- a/index.docx
+++ b/index.docx
@@ -15,7 +15,7 @@
         <w:pStyle w:val="Date"/>
       </w:pPr>
       <w:r>
-        <w:t xml:space="preserve">Last modified: 2026-09-29 00:05:17 (PDT)</w:t>
+        <w:t xml:space="preserve">Last modified: 2026-09-29 13:37:40 (PDT)</w:t>
       </w:r>
     </w:p>
     <w:p>
@@ -26,7 +26,7 @@
         <w:t xml:space="preserve">These notes collect the statistics that data science courses assume.</w:t>
       </w:r>
     </w:p>
-    <w:bookmarkStart w:id="21" w:name="topics"/>
+    <w:bookmarkStart w:id="22" w:name="topics"/>
     <w:p>
       <w:pPr>
         <w:pStyle w:val="Heading2"/>
@@ -60,6 +60,38 @@
         </w:numPr>
       </w:pPr>
       <w:hyperlink r:id="rId9">
+        <w:r>
+          <w:rPr>
+            <w:rStyle w:val="Hyperlink"/>
+          </w:rPr>
+          <w:t xml:space="preserve">Types of variables</w:t>
+        </w:r>
+      </w:hyperlink>
+      <w:r>
+        <w:t xml:space="preserve">:</w:t>
+      </w:r>
+      <w:r>
+        <w:t xml:space="preserve"> </w:t>
+      </w:r>
+      <w:r>
+        <w:t xml:space="preserve">numerical and categorical variables, scales of measurement,</w:t>
+      </w:r>
+      <w:r>
+        <w:t xml:space="preserve"> </w:t>
+      </w:r>
+      <w:r>
+        <w:t xml:space="preserve">the taxonomy of data types, and binary and count random variables;</w:t>
+      </w:r>
+    </w:p>
+    <w:p>
+      <w:pPr>
+        <w:pStyle w:val="Compact"/>
+        <w:numPr>
+          <w:ilvl w:val="0"/>
+          <w:numId w:val="1001"/>
+        </w:numPr>
+      </w:pPr>
+      <w:hyperlink r:id="rId10">
         <w:r>
           <w:rPr>
             <w:rStyle w:val="Hyperlink"/>
@@ -85,7 +117,7 @@
           <w:numId w:val="1001"/>
         </w:numPr>
       </w:pPr>
-      <w:hyperlink r:id="rId10">
+      <w:hyperlink r:id="rId11">
         <w:r>
           <w:rPr>
             <w:rStyle w:val="Hyperlink"/>
@@ -125,7 +157,7 @@
           <w:numId w:val="1002"/>
         </w:numPr>
       </w:pPr>
-      <w:hyperlink r:id="rId11">
+      <w:hyperlink r:id="rId12">
         <w:r>
           <w:rPr>
             <w:rStyle w:val="Hyperlink"/>
@@ -151,7 +183,7 @@
           <w:numId w:val="1002"/>
         </w:numPr>
       </w:pPr>
-      <w:hyperlink r:id="rId12">
+      <w:hyperlink r:id="rId13">
         <w:r>
           <w:rPr>
             <w:rStyle w:val="Hyperlink"/>
@@ -208,7 +240,7 @@
           <w:numId w:val="1002"/>
         </w:numPr>
       </w:pPr>
-      <w:hyperlink r:id="rId13">
+      <w:hyperlink r:id="rId14">
         <w:r>
           <w:rPr>
             <w:rStyle w:val="Hyperlink"/>
@@ -254,7 +286,7 @@
           <w:numId w:val="1003"/>
         </w:numPr>
       </w:pPr>
-      <w:hyperlink r:id="rId14">
+      <w:hyperlink r:id="rId15">
         <w:r>
           <w:rPr>
             <w:rStyle w:val="Hyperlink"/>
@@ -280,7 +312,7 @@
           <w:numId w:val="1003"/>
         </w:numPr>
       </w:pPr>
-      <w:hyperlink r:id="rId15">
+      <w:hyperlink r:id="rId16">
         <w:r>
           <w:rPr>
             <w:rStyle w:val="Hyperlink"/>
@@ -306,7 +338,7 @@
           <w:numId w:val="1003"/>
         </w:numPr>
       </w:pPr>
-      <w:hyperlink r:id="rId16">
+      <w:hyperlink r:id="rId17">
         <w:r>
           <w:rPr>
             <w:rStyle w:val="Hyperlink"/>
@@ -326,7 +358,7 @@
           <w:numId w:val="1003"/>
         </w:numPr>
       </w:pPr>
-      <w:hyperlink r:id="rId17">
+      <w:hyperlink r:id="rId18">
         <w:r>
           <w:rPr>
             <w:rStyle w:val="Hyperlink"/>
@@ -354,7 +386,7 @@
           <w:numId w:val="1004"/>
         </w:numPr>
       </w:pPr>
-      <w:hyperlink r:id="rId18">
+      <w:hyperlink r:id="rId19">
         <w:r>
           <w:rPr>
             <w:rStyle w:val="Hyperlink"/>
@@ -380,7 +412,7 @@
           <w:numId w:val="1004"/>
         </w:numPr>
       </w:pPr>
-      <w:hyperlink r:id="rId19">
+      <w:hyperlink r:id="rId20">
         <w:r>
           <w:rPr>
             <w:rStyle w:val="Hyperlink"/>
@@ -412,7 +444,7 @@
           <w:numId w:val="1004"/>
         </w:numPr>
       </w:pPr>
-      <w:hyperlink r:id="rId20">
+      <w:hyperlink r:id="rId21">
         <w:r>
           <w:rPr>
             <w:rStyle w:val="Hyperlink"/>
@@ -436,8 +468,8 @@
         <w:t xml:space="preserve">and Bayesian model averaging.</w:t>
       </w:r>
     </w:p>
-    <w:bookmarkEnd w:id="21"/>
-    <w:bookmarkStart w:id="25" w:name="origin"/>
+    <w:bookmarkEnd w:id="22"/>
+    <w:bookmarkStart w:id="26" w:name="origin"/>
     <w:p>
       <w:pPr>
         <w:pStyle w:val="Heading2"/>
@@ -456,7 +488,7 @@
       <w:r>
         <w:t xml:space="preserve"> </w:t>
       </w:r>
-      <w:hyperlink r:id="rId22">
+      <w:hyperlink r:id="rId23">
         <w:r>
           <w:rPr>
             <w:rStyle w:val="Hyperlink"/>
@@ -861,7 +893,7 @@
       <w:r>
         <w:t xml:space="preserve"> </w:t>
       </w:r>
-      <w:hyperlink r:id="rId23">
+      <w:hyperlink r:id="rId24">
         <w:r>
           <w:rPr>
             <w:rStyle w:val="Hyperlink"/>
@@ -878,7 +910,7 @@
       <w:r>
         <w:t xml:space="preserve"> </w:t>
       </w:r>
-      <w:hyperlink r:id="rId24">
+      <w:hyperlink r:id="rId25">
         <w:r>
           <w:rPr>
             <w:rStyle w:val="Hyperlink"/>
@@ -899,8 +931,8 @@
         <w:t xml:space="preserve">which are the canonical home for the probability and mathematics appendices of rme.</w:t>
       </w:r>
     </w:p>
-    <w:bookmarkEnd w:id="25"/>
-    <w:bookmarkStart w:id="26" w:name="using-these-notes-in-another-site"/>
+    <w:bookmarkEnd w:id="26"/>
+    <w:bookmarkStart w:id="27" w:name="using-these-notes-in-another-site"/>
     <w:p>
       <w:pPr>
         <w:pStyle w:val="Heading2"/>
@@ -1042,7 +1074,7 @@
         <w:t xml:space="preserve">.</w:t>
       </w:r>
     </w:p>
-    <w:bookmarkEnd w:id="26"/>
+    <w:bookmarkEnd w:id="27"/>
     <w:sectPr>
       <w:footnotePr>
         <w:numRestart w:val="eachSect"/>

</xml_diff>

<commit_message>
Deploying to gh-pages from @ Morrison-Lab/sds@5439df728eeb7917480057a0d81f47fc566d39bd 🚀
</commit_message>
<xml_diff>
--- a/index.docx
+++ b/index.docx
@@ -15,7 +15,7 @@
         <w:pStyle w:val="Date"/>
       </w:pPr>
       <w:r>
-        <w:t xml:space="preserve">Last modified: 2026-10-01 18:10:29 (PDT)</w:t>
+        <w:t xml:space="preserve">Last modified: 2026-10-02 01:38:37 (PDT)</w:t>
       </w:r>
     </w:p>
     <w:p>
@@ -26,7 +26,7 @@
         <w:t xml:space="preserve">These notes collect the statistics that data science courses assume.</w:t>
       </w:r>
     </w:p>
-    <w:bookmarkStart w:id="22" w:name="topics"/>
+    <w:bookmarkStart w:id="23" w:name="topics"/>
     <w:p>
       <w:pPr>
         <w:pStyle w:val="Heading2"/>
@@ -367,7 +367,33 @@
         </w:r>
       </w:hyperlink>
       <w:r>
-        <w:t xml:space="preserve">.</w:t>
+        <w:t xml:space="preserve">;</w:t>
+      </w:r>
+    </w:p>
+    <w:p>
+      <w:pPr>
+        <w:pStyle w:val="Compact"/>
+        <w:numPr>
+          <w:ilvl w:val="0"/>
+          <w:numId w:val="1003"/>
+        </w:numPr>
+      </w:pPr>
+      <w:hyperlink r:id="rId19">
+        <w:r>
+          <w:rPr>
+            <w:rStyle w:val="Hyperlink"/>
+          </w:rPr>
+          <w:t xml:space="preserve">Validating predictions</w:t>
+        </w:r>
+      </w:hyperlink>
+      <w:r>
+        <w:t xml:space="preserve">:</w:t>
+      </w:r>
+      <w:r>
+        <w:t xml:space="preserve"> </w:t>
+      </w:r>
+      <w:r>
+        <w:t xml:space="preserve">overfitting, training/validation/test splits, and cross-validation.</w:t>
       </w:r>
     </w:p>
     <w:p>
@@ -386,7 +412,7 @@
           <w:numId w:val="1004"/>
         </w:numPr>
       </w:pPr>
-      <w:hyperlink r:id="rId19">
+      <w:hyperlink r:id="rId20">
         <w:r>
           <w:rPr>
             <w:rStyle w:val="Hyperlink"/>
@@ -412,7 +438,7 @@
           <w:numId w:val="1004"/>
         </w:numPr>
       </w:pPr>
-      <w:hyperlink r:id="rId20">
+      <w:hyperlink r:id="rId21">
         <w:r>
           <w:rPr>
             <w:rStyle w:val="Hyperlink"/>
@@ -444,7 +470,7 @@
           <w:numId w:val="1004"/>
         </w:numPr>
       </w:pPr>
-      <w:hyperlink r:id="rId21">
+      <w:hyperlink r:id="rId22">
         <w:r>
           <w:rPr>
             <w:rStyle w:val="Hyperlink"/>
@@ -468,8 +494,8 @@
         <w:t xml:space="preserve">and Bayesian model averaging.</w:t>
       </w:r>
     </w:p>
-    <w:bookmarkEnd w:id="22"/>
-    <w:bookmarkStart w:id="26" w:name="origin"/>
+    <w:bookmarkEnd w:id="23"/>
+    <w:bookmarkStart w:id="27" w:name="origin"/>
     <w:p>
       <w:pPr>
         <w:pStyle w:val="Heading2"/>
@@ -488,7 +514,7 @@
       <w:r>
         <w:t xml:space="preserve"> </w:t>
       </w:r>
-      <w:hyperlink r:id="rId23">
+      <w:hyperlink r:id="rId24">
         <w:r>
           <w:rPr>
             <w:rStyle w:val="Hyperlink"/>
@@ -893,7 +919,7 @@
       <w:r>
         <w:t xml:space="preserve"> </w:t>
       </w:r>
-      <w:hyperlink r:id="rId24">
+      <w:hyperlink r:id="rId25">
         <w:r>
           <w:rPr>
             <w:rStyle w:val="Hyperlink"/>
@@ -910,7 +936,7 @@
       <w:r>
         <w:t xml:space="preserve"> </w:t>
       </w:r>
-      <w:hyperlink r:id="rId25">
+      <w:hyperlink r:id="rId26">
         <w:r>
           <w:rPr>
             <w:rStyle w:val="Hyperlink"/>
@@ -931,8 +957,8 @@
         <w:t xml:space="preserve">which are the canonical home for the probability and mathematics appendices of rme.</w:t>
       </w:r>
     </w:p>
-    <w:bookmarkEnd w:id="26"/>
-    <w:bookmarkStart w:id="27" w:name="using-these-notes-in-another-site"/>
+    <w:bookmarkEnd w:id="27"/>
+    <w:bookmarkStart w:id="28" w:name="using-these-notes-in-another-site"/>
     <w:p>
       <w:pPr>
         <w:pStyle w:val="Heading2"/>
@@ -1074,7 +1100,7 @@
         <w:t xml:space="preserve">.</w:t>
       </w:r>
     </w:p>
-    <w:bookmarkEnd w:id="27"/>
+    <w:bookmarkEnd w:id="28"/>
     <w:sectPr>
       <w:footnotePr>
         <w:numRestart w:val="eachSect"/>

</xml_diff>

<commit_message>
Deploying to gh-pages from @ Morrison-Lab/sds@111a60f7d23033731032902e30b25e44596286e0 🚀
</commit_message>
<xml_diff>
--- a/index.docx
+++ b/index.docx
@@ -15,7 +15,7 @@
         <w:pStyle w:val="Date"/>
       </w:pPr>
       <w:r>
-        <w:t xml:space="preserve">Last modified: 2026-10-06 01:35:15 (PDT)</w:t>
+        <w:t xml:space="preserve">Last modified: 2026-10-06 01:50:41 (PDT)</w:t>
       </w:r>
     </w:p>
     <w:p>
@@ -989,7 +989,19 @@
         <w:pStyle w:val="FirstParagraph"/>
       </w:pPr>
       <w:r>
-        <w:t xml:space="preserve">Course sites include these notes as a git submodule named</w:t>
+        <w:t xml:space="preserve">Course sites link to these pages by URL;</w:t>
+      </w:r>
+      <w:r>
+        <w:t xml:space="preserve"> </w:t>
+      </w:r>
+      <w:r>
+        <w:t xml:space="preserve">they do not include this repository as a git submodule.</w:t>
+      </w:r>
+      <w:r>
+        <w:t xml:space="preserve"> </w:t>
+      </w:r>
+      <w:r>
+        <w:t xml:space="preserve">A host site that keeps a copy of this repository at its root, named</w:t>
       </w:r>
       <w:r>
         <w:t xml:space="preserve"> </w:t>
@@ -1001,16 +1013,13 @@
         <w:t xml:space="preserve">sds</w:t>
       </w:r>
       <w:r>
-        <w:t xml:space="preserve"> </w:t>
-      </w:r>
-      <w:r>
-        <w:t xml:space="preserve">at the site’s root,</w:t>
-      </w:r>
-      <w:r>
-        <w:t xml:space="preserve"> </w:t>
-      </w:r>
-      <w:r>
-        <w:t xml:space="preserve">and include fragments with paths that start with</w:t>
+        <w:t xml:space="preserve">,</w:t>
+      </w:r>
+      <w:r>
+        <w:t xml:space="preserve"> </w:t>
+      </w:r>
+      <w:r>
+        <w:t xml:space="preserve">can still include fragments with paths that start with</w:t>
       </w:r>
       <w:r>
         <w:t xml:space="preserve"> </w:t>

</xml_diff>

<commit_message>
Deploying to gh-pages from @ Morrison-Lab/sds@750853d6d6b6a3065e057d755dc73df7998e4045 🚀
</commit_message>
<xml_diff>
--- a/index.docx
+++ b/index.docx
@@ -15,7 +15,7 @@
         <w:pStyle w:val="Date"/>
       </w:pPr>
       <w:r>
-        <w:t xml:space="preserve">Last modified: 2026-10-09 12:07:46 (PDT)</w:t>
+        <w:t xml:space="preserve">Last modified: 2026-10-09 13:41:56 (PDT)</w:t>
       </w:r>
     </w:p>
     <w:p>
@@ -26,7 +26,7 @@
         <w:t xml:space="preserve">These notes collect the statistics that data science courses assume.</w:t>
       </w:r>
     </w:p>
-    <w:bookmarkStart w:id="23" w:name="topics"/>
+    <w:bookmarkStart w:id="24" w:name="topics"/>
     <w:p>
       <w:pPr>
         <w:pStyle w:val="Heading2"/>
@@ -275,7 +275,7 @@
         <w:pStyle w:val="FirstParagraph"/>
       </w:pPr>
       <w:r>
-        <w:t xml:space="preserve">Methods, illustrated with the HERS data:</w:t>
+        <w:t xml:space="preserve">Methods:</w:t>
       </w:r>
     </w:p>
     <w:p>
@@ -410,7 +410,39 @@
         <w:t xml:space="preserve"> </w:t>
       </w:r>
       <w:r>
-        <w:t xml:space="preserve">and choosing a model by cross-validation.</w:t>
+        <w:t xml:space="preserve">and choosing a model by cross-validation;</w:t>
+      </w:r>
+    </w:p>
+    <w:p>
+      <w:pPr>
+        <w:pStyle w:val="Compact"/>
+        <w:numPr>
+          <w:ilvl w:val="0"/>
+          <w:numId w:val="1003"/>
+        </w:numPr>
+      </w:pPr>
+      <w:hyperlink r:id="rId20">
+        <w:r>
+          <w:rPr>
+            <w:rStyle w:val="Hyperlink"/>
+          </w:rPr>
+          <w:t xml:space="preserve">Classification and diagnostic tests</w:t>
+        </w:r>
+      </w:hyperlink>
+      <w:r>
+        <w:t xml:space="preserve">:</w:t>
+      </w:r>
+      <w:r>
+        <w:t xml:space="preserve"> </w:t>
+      </w:r>
+      <w:r>
+        <w:t xml:space="preserve">sensitivity, specificity, prevalence,</w:t>
+      </w:r>
+      <w:r>
+        <w:t xml:space="preserve"> </w:t>
+      </w:r>
+      <w:r>
+        <w:t xml:space="preserve">and positive and negative predictive values.</w:t>
       </w:r>
     </w:p>
     <w:p>
@@ -429,7 +461,7 @@
           <w:numId w:val="1004"/>
         </w:numPr>
       </w:pPr>
-      <w:hyperlink r:id="rId20">
+      <w:hyperlink r:id="rId21">
         <w:r>
           <w:rPr>
             <w:rStyle w:val="Hyperlink"/>
@@ -455,7 +487,7 @@
           <w:numId w:val="1004"/>
         </w:numPr>
       </w:pPr>
-      <w:hyperlink r:id="rId21">
+      <w:hyperlink r:id="rId22">
         <w:r>
           <w:rPr>
             <w:rStyle w:val="Hyperlink"/>
@@ -487,7 +519,7 @@
           <w:numId w:val="1004"/>
         </w:numPr>
       </w:pPr>
-      <w:hyperlink r:id="rId22">
+      <w:hyperlink r:id="rId23">
         <w:r>
           <w:rPr>
             <w:rStyle w:val="Hyperlink"/>
@@ -511,8 +543,8 @@
         <w:t xml:space="preserve">and Bayesian model averaging.</w:t>
       </w:r>
     </w:p>
-    <w:bookmarkEnd w:id="23"/>
-    <w:bookmarkStart w:id="27" w:name="origin"/>
+    <w:bookmarkEnd w:id="24"/>
+    <w:bookmarkStart w:id="28" w:name="origin"/>
     <w:p>
       <w:pPr>
         <w:pStyle w:val="Heading2"/>
@@ -531,7 +563,7 @@
       <w:r>
         <w:t xml:space="preserve"> </w:t>
       </w:r>
-      <w:hyperlink r:id="rId24">
+      <w:hyperlink r:id="rId25">
         <w:r>
           <w:rPr>
             <w:rStyle w:val="Hyperlink"/>
@@ -936,7 +968,7 @@
       <w:r>
         <w:t xml:space="preserve"> </w:t>
       </w:r>
-      <w:hyperlink r:id="rId25">
+      <w:hyperlink r:id="rId26">
         <w:r>
           <w:rPr>
             <w:rStyle w:val="Hyperlink"/>
@@ -953,7 +985,7 @@
       <w:r>
         <w:t xml:space="preserve"> </w:t>
       </w:r>
-      <w:hyperlink r:id="rId26">
+      <w:hyperlink r:id="rId27">
         <w:r>
           <w:rPr>
             <w:rStyle w:val="Hyperlink"/>
@@ -974,8 +1006,8 @@
         <w:t xml:space="preserve">which are the canonical home for the probability and mathematics appendices of rme.</w:t>
       </w:r>
     </w:p>
-    <w:bookmarkEnd w:id="27"/>
-    <w:bookmarkStart w:id="28" w:name="using-these-notes-in-another-site"/>
+    <w:bookmarkEnd w:id="28"/>
+    <w:bookmarkStart w:id="29" w:name="using-these-notes-in-another-site"/>
     <w:p>
       <w:pPr>
         <w:pStyle w:val="Heading2"/>
@@ -1126,7 +1158,7 @@
         <w:t xml:space="preserve">.</w:t>
       </w:r>
     </w:p>
-    <w:bookmarkEnd w:id="28"/>
+    <w:bookmarkEnd w:id="29"/>
     <w:sectPr>
       <w:footnotePr>
         <w:numRestart w:val="eachSect"/>

</xml_diff>

<commit_message>
Deploying to gh-pages from @ Morrison-Lab/sds@6ad9de5b899f5811685bf21e455459ba0dc47761 🚀
</commit_message>
<xml_diff>
--- a/index.docx
+++ b/index.docx
@@ -15,7 +15,7 @@
         <w:pStyle w:val="Date"/>
       </w:pPr>
       <w:r>
-        <w:t xml:space="preserve">Last modified: 2026-10-12 20:39:40 (PDT)</w:t>
+        <w:t xml:space="preserve">Last modified: 2026-10-12 20:54:41 (PDT)</w:t>
       </w:r>
     </w:p>
     <w:p>
@@ -26,7 +26,7 @@
         <w:t xml:space="preserve">These notes collect the statistics that data science courses assume.</w:t>
       </w:r>
     </w:p>
-    <w:bookmarkStart w:id="24" w:name="topics"/>
+    <w:bookmarkStart w:id="26" w:name="topics"/>
     <w:p>
       <w:pPr>
         <w:pStyle w:val="Heading2"/>
@@ -383,6 +383,76 @@
           <w:rPr>
             <w:rStyle w:val="Hyperlink"/>
           </w:rPr>
+          <w:t xml:space="preserve">Permutation tests</w:t>
+        </w:r>
+      </w:hyperlink>
+      <w:r>
+        <w:t xml:space="preserve">:</w:t>
+      </w:r>
+      <w:r>
+        <w:t xml:space="preserve"> </w:t>
+      </w:r>
+      <w:r>
+        <w:t xml:space="preserve">exchangeability, the permutation distribution,</w:t>
+      </w:r>
+      <w:r>
+        <w:t xml:space="preserve"> </w:t>
+      </w:r>
+      <w:r>
+        <w:t xml:space="preserve">and exact and Monte Carlo permutation p-values;</w:t>
+      </w:r>
+    </w:p>
+    <w:p>
+      <w:pPr>
+        <w:pStyle w:val="Compact"/>
+        <w:numPr>
+          <w:ilvl w:val="0"/>
+          <w:numId w:val="1003"/>
+        </w:numPr>
+      </w:pPr>
+      <w:hyperlink r:id="rId20">
+        <w:r>
+          <w:rPr>
+            <w:rStyle w:val="Hyperlink"/>
+          </w:rPr>
+          <w:t xml:space="preserve">Multiple testing</w:t>
+        </w:r>
+      </w:hyperlink>
+      <w:r>
+        <w:t xml:space="preserve">:</w:t>
+      </w:r>
+      <w:r>
+        <w:t xml:space="preserve"> </w:t>
+      </w:r>
+      <w:r>
+        <w:t xml:space="preserve">the family-wise error rate, the false discovery rate,</w:t>
+      </w:r>
+      <w:r>
+        <w:t xml:space="preserve"> </w:t>
+      </w:r>
+      <w:r>
+        <w:t xml:space="preserve">the Bonferroni, Holm, and Benjamini–Hochberg procedures,</w:t>
+      </w:r>
+      <w:r>
+        <w:t xml:space="preserve"> </w:t>
+      </w:r>
+      <w:r>
+        <w:t xml:space="preserve">and adjusted p-values;</w:t>
+      </w:r>
+    </w:p>
+    <w:p>
+      <w:pPr>
+        <w:pStyle w:val="Compact"/>
+        <w:numPr>
+          <w:ilvl w:val="0"/>
+          <w:numId w:val="1003"/>
+        </w:numPr>
+      </w:pPr>
+      <w:hyperlink r:id="rId21">
+        <w:r>
+          <w:rPr>
+            <w:rStyle w:val="Hyperlink"/>
+          </w:rPr>
           <w:t xml:space="preserve">Validating predictions</w:t>
         </w:r>
       </w:hyperlink>
@@ -421,7 +491,7 @@
           <w:numId w:val="1003"/>
         </w:numPr>
       </w:pPr>
-      <w:hyperlink r:id="rId20">
+      <w:hyperlink r:id="rId22">
         <w:r>
           <w:rPr>
             <w:rStyle w:val="Hyperlink"/>
@@ -461,7 +531,7 @@
           <w:numId w:val="1004"/>
         </w:numPr>
       </w:pPr>
-      <w:hyperlink r:id="rId21">
+      <w:hyperlink r:id="rId23">
         <w:r>
           <w:rPr>
             <w:rStyle w:val="Hyperlink"/>
@@ -487,7 +557,7 @@
           <w:numId w:val="1004"/>
         </w:numPr>
       </w:pPr>
-      <w:hyperlink r:id="rId22">
+      <w:hyperlink r:id="rId24">
         <w:r>
           <w:rPr>
             <w:rStyle w:val="Hyperlink"/>
@@ -519,7 +589,7 @@
           <w:numId w:val="1004"/>
         </w:numPr>
       </w:pPr>
-      <w:hyperlink r:id="rId23">
+      <w:hyperlink r:id="rId25">
         <w:r>
           <w:rPr>
             <w:rStyle w:val="Hyperlink"/>
@@ -543,8 +613,8 @@
         <w:t xml:space="preserve">and Bayesian model averaging.</w:t>
       </w:r>
     </w:p>
-    <w:bookmarkEnd w:id="24"/>
-    <w:bookmarkStart w:id="28" w:name="origin"/>
+    <w:bookmarkEnd w:id="26"/>
+    <w:bookmarkStart w:id="30" w:name="origin"/>
     <w:p>
       <w:pPr>
         <w:pStyle w:val="Heading2"/>
@@ -563,7 +633,7 @@
       <w:r>
         <w:t xml:space="preserve"> </w:t>
       </w:r>
-      <w:hyperlink r:id="rId25">
+      <w:hyperlink r:id="rId27">
         <w:r>
           <w:rPr>
             <w:rStyle w:val="Hyperlink"/>
@@ -968,7 +1038,7 @@
       <w:r>
         <w:t xml:space="preserve"> </w:t>
       </w:r>
-      <w:hyperlink r:id="rId26">
+      <w:hyperlink r:id="rId28">
         <w:r>
           <w:rPr>
             <w:rStyle w:val="Hyperlink"/>
@@ -985,7 +1055,7 @@
       <w:r>
         <w:t xml:space="preserve"> </w:t>
       </w:r>
-      <w:hyperlink r:id="rId27">
+      <w:hyperlink r:id="rId29">
         <w:r>
           <w:rPr>
             <w:rStyle w:val="Hyperlink"/>
@@ -1006,8 +1076,8 @@
         <w:t xml:space="preserve">which are the canonical home for the probability and mathematics appendices of rme.</w:t>
       </w:r>
     </w:p>
-    <w:bookmarkEnd w:id="28"/>
-    <w:bookmarkStart w:id="29" w:name="using-these-notes-in-another-site"/>
+    <w:bookmarkEnd w:id="30"/>
+    <w:bookmarkStart w:id="31" w:name="using-these-notes-in-another-site"/>
     <w:p>
       <w:pPr>
         <w:pStyle w:val="Heading2"/>
@@ -1158,7 +1228,7 @@
         <w:t xml:space="preserve">.</w:t>
       </w:r>
     </w:p>
-    <w:bookmarkEnd w:id="29"/>
+    <w:bookmarkEnd w:id="31"/>
     <w:sectPr>
       <w:footnotePr>
         <w:numRestart w:val="eachSect"/>

</xml_diff>

<commit_message>
Deploying to gh-pages from @ Morrison-Lab/sds@35a98e1ce12d38ed8b4ac81dc1112708a09844c0 🚀
</commit_message>
<xml_diff>
--- a/index.docx
+++ b/index.docx
@@ -15,7 +15,7 @@
         <w:pStyle w:val="Date"/>
       </w:pPr>
       <w:r>
-        <w:t xml:space="preserve">Last modified: 2026-10-13 00:51:10 (PDT)</w:t>
+        <w:t xml:space="preserve">Last modified: 2026-10-13 16:43:17 (PDT)</w:t>
       </w:r>
     </w:p>
     <w:p>
@@ -614,12 +614,227 @@
       </w:r>
     </w:p>
     <w:bookmarkEnd w:id="26"/>
-    <w:bookmarkStart w:id="30" w:name="origin"/>
+    <w:bookmarkStart w:id="32" w:name="comparable-courses"/>
     <w:p>
       <w:pPr>
         <w:pStyle w:val="Heading2"/>
       </w:pPr>
       <w:r>
+        <w:t xml:space="preserve">Comparable courses</w:t>
+      </w:r>
+    </w:p>
+    <w:p>
+      <w:pPr>
+        <w:pStyle w:val="FirstParagraph"/>
+      </w:pPr>
+      <w:r>
+        <w:t xml:space="preserve">Stanford’s statistics department posts the materials of several courses</w:t>
+      </w:r>
+      <w:r>
+        <w:t xml:space="preserve"> </w:t>
+      </w:r>
+      <w:r>
+        <w:t xml:space="preserve">that cover the same inference topics at a more mathematical level:</w:t>
+      </w:r>
+    </w:p>
+    <w:p>
+      <w:pPr>
+        <w:pStyle w:val="Compact"/>
+        <w:numPr>
+          <w:ilvl w:val="0"/>
+          <w:numId w:val="1005"/>
+        </w:numPr>
+      </w:pPr>
+      <w:r>
+        <w:rPr>
+          <w:b/>
+          <w:bCs/>
+        </w:rPr>
+        <w:t xml:space="preserve">STATS 200</w:t>
+      </w:r>
+      <w:r>
+        <w:t xml:space="preserve">,</w:t>
+      </w:r>
+      <w:r>
+        <w:t xml:space="preserve"> </w:t>
+      </w:r>
+      <w:hyperlink r:id="rId27">
+        <w:r>
+          <w:rPr>
+            <w:rStyle w:val="Hyperlink"/>
+            <w:i/>
+            <w:iCs/>
+          </w:rPr>
+          <w:t xml:space="preserve">Introduction to Statistical Inference</w:t>
+        </w:r>
+      </w:hyperlink>
+      <w:r>
+        <w:t xml:space="preserve"> </w:t>
+      </w:r>
+      <w:r>
+        <w:t xml:space="preserve">(Zhou Fan, Autumn 2016): 29 lecture PDFs on testing, maximum likelihood, the bootstrap,</w:t>
+      </w:r>
+      <w:r>
+        <w:t xml:space="preserve"> </w:t>
+      </w:r>
+      <w:r>
+        <w:t xml:space="preserve">Bayesian analysis and regression, following Rice’s</w:t>
+      </w:r>
+      <w:r>
+        <w:t xml:space="preserve"> </w:t>
+      </w:r>
+      <w:r>
+        <w:rPr>
+          <w:i/>
+          <w:iCs/>
+        </w:rPr>
+        <w:t xml:space="preserve">Mathematical Statistics and Data Analysis</w:t>
+      </w:r>
+      <w:r>
+        <w:t xml:space="preserve">.</w:t>
+      </w:r>
+    </w:p>
+    <w:p>
+      <w:pPr>
+        <w:pStyle w:val="Compact"/>
+        <w:numPr>
+          <w:ilvl w:val="0"/>
+          <w:numId w:val="1005"/>
+        </w:numPr>
+      </w:pPr>
+      <w:r>
+        <w:rPr>
+          <w:b/>
+          <w:bCs/>
+        </w:rPr>
+        <w:t xml:space="preserve">STATS 300A</w:t>
+      </w:r>
+      <w:r>
+        <w:t xml:space="preserve">,</w:t>
+      </w:r>
+      <w:r>
+        <w:t xml:space="preserve"> </w:t>
+      </w:r>
+      <w:hyperlink r:id="rId28">
+        <w:r>
+          <w:rPr>
+            <w:rStyle w:val="Hyperlink"/>
+            <w:i/>
+            <w:iCs/>
+          </w:rPr>
+          <w:t xml:space="preserve">Theory of Statistics</w:t>
+        </w:r>
+      </w:hyperlink>
+      <w:r>
+        <w:t xml:space="preserve"> </w:t>
+      </w:r>
+      <w:r>
+        <w:t xml:space="preserve">(Andrea Montanari, Autumn 2018; see also</w:t>
+      </w:r>
+      <w:r>
+        <w:t xml:space="preserve"> </w:t>
+      </w:r>
+      <w:hyperlink r:id="rId29">
+        <w:r>
+          <w:rPr>
+            <w:rStyle w:val="Hyperlink"/>
+          </w:rPr>
+          <w:t xml:space="preserve">Lester Mackey’s 2015 scribed notes</w:t>
+        </w:r>
+      </w:hyperlink>
+      <w:r>
+        <w:t xml:space="preserve">):</w:t>
+      </w:r>
+      <w:r>
+        <w:t xml:space="preserve"> </w:t>
+      </w:r>
+      <w:r>
+        <w:t xml:space="preserve">finite-sample optimality, exponential families, and testing theory.</w:t>
+      </w:r>
+    </w:p>
+    <w:p>
+      <w:pPr>
+        <w:pStyle w:val="Compact"/>
+        <w:numPr>
+          <w:ilvl w:val="0"/>
+          <w:numId w:val="1005"/>
+        </w:numPr>
+      </w:pPr>
+      <w:r>
+        <w:rPr>
+          <w:b/>
+          <w:bCs/>
+        </w:rPr>
+        <w:t xml:space="preserve">STATS 300B</w:t>
+      </w:r>
+      <w:r>
+        <w:t xml:space="preserve">,</w:t>
+      </w:r>
+      <w:r>
+        <w:t xml:space="preserve"> </w:t>
+      </w:r>
+      <w:hyperlink r:id="rId30">
+        <w:r>
+          <w:rPr>
+            <w:rStyle w:val="Hyperlink"/>
+            <w:i/>
+            <w:iCs/>
+          </w:rPr>
+          <w:t xml:space="preserve">Theory of Statistics II</w:t>
+        </w:r>
+      </w:hyperlink>
+      <w:r>
+        <w:t xml:space="preserve"> </w:t>
+      </w:r>
+      <w:r>
+        <w:t xml:space="preserve">(John Duchi, Winter 2021): slides on asymptotic statistics and concentration.</w:t>
+      </w:r>
+    </w:p>
+    <w:p>
+      <w:pPr>
+        <w:pStyle w:val="Compact"/>
+        <w:numPr>
+          <w:ilvl w:val="0"/>
+          <w:numId w:val="1005"/>
+        </w:numPr>
+      </w:pPr>
+      <w:r>
+        <w:rPr>
+          <w:b/>
+          <w:bCs/>
+        </w:rPr>
+        <w:t xml:space="preserve">STATS 305B</w:t>
+      </w:r>
+      <w:r>
+        <w:t xml:space="preserve">,</w:t>
+      </w:r>
+      <w:r>
+        <w:t xml:space="preserve"> </w:t>
+      </w:r>
+      <w:hyperlink r:id="rId31">
+        <w:r>
+          <w:rPr>
+            <w:rStyle w:val="Hyperlink"/>
+            <w:i/>
+            <w:iCs/>
+          </w:rPr>
+          <w:t xml:space="preserve">Methods for Applied Statistics</w:t>
+        </w:r>
+      </w:hyperlink>
+      <w:r>
+        <w:t xml:space="preserve"> </w:t>
+      </w:r>
+      <w:r>
+        <w:t xml:space="preserve">(Jonathan Taylor): contingency tables, logistic regression and generalized linear models.</w:t>
+      </w:r>
+    </w:p>
+    <w:bookmarkEnd w:id="32"/>
+    <w:bookmarkStart w:id="36" w:name="origin"/>
+    <w:p>
+      <w:pPr>
+        <w:pStyle w:val="Heading2"/>
+      </w:pPr>
+      <w:r>
         <w:t xml:space="preserve">2 Origin</w:t>
       </w:r>
     </w:p>
@@ -633,7 +848,7 @@
       <w:r>
         <w:t xml:space="preserve"> </w:t>
       </w:r>
-      <w:hyperlink r:id="rId27">
+      <w:hyperlink r:id="rId33">
         <w:r>
           <w:rPr>
             <w:rStyle w:val="Hyperlink"/>
@@ -691,7 +906,7 @@
         <w:pStyle w:val="Compact"/>
         <w:numPr>
           <w:ilvl w:val="0"/>
-          <w:numId w:val="1005"/>
+          <w:numId w:val="1006"/>
         </w:numPr>
       </w:pPr>
       <w:r>
@@ -718,7 +933,7 @@
         <w:pStyle w:val="Compact"/>
         <w:numPr>
           <w:ilvl w:val="0"/>
-          <w:numId w:val="1005"/>
+          <w:numId w:val="1006"/>
         </w:numPr>
       </w:pPr>
       <w:r>
@@ -736,7 +951,7 @@
         <w:pStyle w:val="Compact"/>
         <w:numPr>
           <w:ilvl w:val="0"/>
-          <w:numId w:val="1005"/>
+          <w:numId w:val="1006"/>
         </w:numPr>
       </w:pPr>
       <w:r>
@@ -883,7 +1098,7 @@
         <w:pStyle w:val="Compact"/>
         <w:numPr>
           <w:ilvl w:val="0"/>
-          <w:numId w:val="1005"/>
+          <w:numId w:val="1006"/>
         </w:numPr>
       </w:pPr>
       <w:r>
@@ -961,7 +1176,7 @@
         <w:pStyle w:val="Compact"/>
         <w:numPr>
           <w:ilvl w:val="0"/>
-          <w:numId w:val="1005"/>
+          <w:numId w:val="1006"/>
         </w:numPr>
       </w:pPr>
       <w:r>
@@ -1038,7 +1253,7 @@
       <w:r>
         <w:t xml:space="preserve"> </w:t>
       </w:r>
-      <w:hyperlink r:id="rId28">
+      <w:hyperlink r:id="rId34">
         <w:r>
           <w:rPr>
             <w:rStyle w:val="Hyperlink"/>
@@ -1055,7 +1270,7 @@
       <w:r>
         <w:t xml:space="preserve"> </w:t>
       </w:r>
-      <w:hyperlink r:id="rId29">
+      <w:hyperlink r:id="rId35">
         <w:r>
           <w:rPr>
             <w:rStyle w:val="Hyperlink"/>
@@ -1076,8 +1291,8 @@
         <w:t xml:space="preserve">which are the canonical home for the probability and mathematics appendices of rme.</w:t>
       </w:r>
     </w:p>
-    <w:bookmarkEnd w:id="30"/>
-    <w:bookmarkStart w:id="31" w:name="using-these-notes-in-another-site"/>
+    <w:bookmarkEnd w:id="36"/>
+    <w:bookmarkStart w:id="37" w:name="using-these-notes-in-another-site"/>
     <w:p>
       <w:pPr>
         <w:pStyle w:val="Heading2"/>
@@ -1228,7 +1443,7 @@
         <w:t xml:space="preserve">.</w:t>
       </w:r>
     </w:p>
-    <w:bookmarkEnd w:id="31"/>
+    <w:bookmarkEnd w:id="37"/>
     <w:sectPr>
       <w:footnotePr>
         <w:numRestart w:val="eachSect"/>
@@ -1458,6 +1673,9 @@
     <w:abstractNumId w:val="991"/>
   </w:num>
   <w:num w:numId="1005">
+    <w:abstractNumId w:val="991"/>
+  </w:num>
+  <w:num w:numId="1006">
     <w:abstractNumId w:val="991"/>
   </w:num>
 </w:numbering>

</xml_diff>

<commit_message>
Deploying to gh-pages from @ Morrison-Lab/sds@7e4adbde476c4590e540203b8189d48dfbc339ed 🚀
</commit_message>
<xml_diff>
--- a/index.docx
+++ b/index.docx
@@ -15,7 +15,7 @@
         <w:pStyle w:val="Date"/>
       </w:pPr>
       <w:r>
-        <w:t xml:space="preserve">Last modified: 2026-10-15 02:31:46 (PDT)</w:t>
+        <w:t xml:space="preserve">Last modified: 2026-10-15 02:43:30 (PDT)</w:t>
       </w:r>
     </w:p>
     <w:p>
@@ -26,7 +26,7 @@
         <w:t xml:space="preserve">These notes collect the statistics that data science courses assume.</w:t>
       </w:r>
     </w:p>
-    <w:bookmarkStart w:id="26" w:name="topics"/>
+    <w:bookmarkStart w:id="27" w:name="topics"/>
     <w:p>
       <w:pPr>
         <w:pStyle w:val="Heading2"/>
@@ -267,7 +267,33 @@
         <w:t xml:space="preserve"> </w:t>
       </w:r>
       <w:r>
-        <w:t xml:space="preserve">with worked examples.</w:t>
+        <w:t xml:space="preserve">with worked examples;</w:t>
+      </w:r>
+    </w:p>
+    <w:p>
+      <w:pPr>
+        <w:pStyle w:val="Compact"/>
+        <w:numPr>
+          <w:ilvl w:val="0"/>
+          <w:numId w:val="1002"/>
+        </w:numPr>
+      </w:pPr>
+      <w:hyperlink r:id="rId15">
+        <w:r>
+          <w:rPr>
+            <w:rStyle w:val="Hyperlink"/>
+          </w:rPr>
+          <w:t xml:space="preserve">Properties of estimators</w:t>
+        </w:r>
+      </w:hyperlink>
+      <w:r>
+        <w:t xml:space="preserve">:</w:t>
+      </w:r>
+      <w:r>
+        <w:t xml:space="preserve"> </w:t>
+      </w:r>
+      <w:r>
+        <w:t xml:space="preserve">consistency, relative efficiency, and the Cramér–Rao lower bound.</w:t>
       </w:r>
     </w:p>
     <w:p>
@@ -286,7 +312,7 @@
           <w:numId w:val="1003"/>
         </w:numPr>
       </w:pPr>
-      <w:hyperlink r:id="rId15">
+      <w:hyperlink r:id="rId16">
         <w:r>
           <w:rPr>
             <w:rStyle w:val="Hyperlink"/>
@@ -312,7 +338,7 @@
           <w:numId w:val="1003"/>
         </w:numPr>
       </w:pPr>
-      <w:hyperlink r:id="rId16">
+      <w:hyperlink r:id="rId17">
         <w:r>
           <w:rPr>
             <w:rStyle w:val="Hyperlink"/>
@@ -338,7 +364,7 @@
           <w:numId w:val="1003"/>
         </w:numPr>
       </w:pPr>
-      <w:hyperlink r:id="rId17">
+      <w:hyperlink r:id="rId18">
         <w:r>
           <w:rPr>
             <w:rStyle w:val="Hyperlink"/>
@@ -358,7 +384,7 @@
           <w:numId w:val="1003"/>
         </w:numPr>
       </w:pPr>
-      <w:hyperlink r:id="rId18">
+      <w:hyperlink r:id="rId19">
         <w:r>
           <w:rPr>
             <w:rStyle w:val="Hyperlink"/>
@@ -378,7 +404,7 @@
           <w:numId w:val="1003"/>
         </w:numPr>
       </w:pPr>
-      <w:hyperlink r:id="rId19">
+      <w:hyperlink r:id="rId20">
         <w:r>
           <w:rPr>
             <w:rStyle w:val="Hyperlink"/>
@@ -410,7 +436,7 @@
           <w:numId w:val="1003"/>
         </w:numPr>
       </w:pPr>
-      <w:hyperlink r:id="rId20">
+      <w:hyperlink r:id="rId21">
         <w:r>
           <w:rPr>
             <w:rStyle w:val="Hyperlink"/>
@@ -448,7 +474,7 @@
           <w:numId w:val="1003"/>
         </w:numPr>
       </w:pPr>
-      <w:hyperlink r:id="rId21">
+      <w:hyperlink r:id="rId22">
         <w:r>
           <w:rPr>
             <w:rStyle w:val="Hyperlink"/>
@@ -491,7 +517,7 @@
           <w:numId w:val="1003"/>
         </w:numPr>
       </w:pPr>
-      <w:hyperlink r:id="rId22">
+      <w:hyperlink r:id="rId23">
         <w:r>
           <w:rPr>
             <w:rStyle w:val="Hyperlink"/>
@@ -531,7 +557,7 @@
           <w:numId w:val="1004"/>
         </w:numPr>
       </w:pPr>
-      <w:hyperlink r:id="rId23">
+      <w:hyperlink r:id="rId24">
         <w:r>
           <w:rPr>
             <w:rStyle w:val="Hyperlink"/>
@@ -557,7 +583,7 @@
           <w:numId w:val="1004"/>
         </w:numPr>
       </w:pPr>
-      <w:hyperlink r:id="rId24">
+      <w:hyperlink r:id="rId25">
         <w:r>
           <w:rPr>
             <w:rStyle w:val="Hyperlink"/>
@@ -589,7 +615,7 @@
           <w:numId w:val="1004"/>
         </w:numPr>
       </w:pPr>
-      <w:hyperlink r:id="rId25">
+      <w:hyperlink r:id="rId26">
         <w:r>
           <w:rPr>
             <w:rStyle w:val="Hyperlink"/>
@@ -613,8 +639,8 @@
         <w:t xml:space="preserve">and Bayesian model averaging.</w:t>
       </w:r>
     </w:p>
-    <w:bookmarkEnd w:id="26"/>
-    <w:bookmarkStart w:id="32" w:name="comparable-courses"/>
+    <w:bookmarkEnd w:id="27"/>
+    <w:bookmarkStart w:id="33" w:name="comparable-courses"/>
     <w:p>
       <w:pPr>
         <w:pStyle w:val="Heading2"/>
@@ -658,7 +684,7 @@
       <w:r>
         <w:t xml:space="preserve"> </w:t>
       </w:r>
-      <w:hyperlink r:id="rId27">
+      <w:hyperlink r:id="rId28">
         <w:r>
           <w:rPr>
             <w:rStyle w:val="Hyperlink"/>
@@ -715,7 +741,7 @@
       <w:r>
         <w:t xml:space="preserve"> </w:t>
       </w:r>
-      <w:hyperlink r:id="rId28">
+      <w:hyperlink r:id="rId29">
         <w:r>
           <w:rPr>
             <w:rStyle w:val="Hyperlink"/>
@@ -734,7 +760,7 @@
       <w:r>
         <w:t xml:space="preserve"> </w:t>
       </w:r>
-      <w:hyperlink r:id="rId29">
+      <w:hyperlink r:id="rId30">
         <w:r>
           <w:rPr>
             <w:rStyle w:val="Hyperlink"/>
@@ -773,7 +799,7 @@
       <w:r>
         <w:t xml:space="preserve"> </w:t>
       </w:r>
-      <w:hyperlink r:id="rId30">
+      <w:hyperlink r:id="rId31">
         <w:r>
           <w:rPr>
             <w:rStyle w:val="Hyperlink"/>
@@ -811,7 +837,7 @@
       <w:r>
         <w:t xml:space="preserve"> </w:t>
       </w:r>
-      <w:hyperlink r:id="rId31">
+      <w:hyperlink r:id="rId32">
         <w:r>
           <w:rPr>
             <w:rStyle w:val="Hyperlink"/>
@@ -828,8 +854,8 @@
         <w:t xml:space="preserve">(Jonathan Taylor): contingency tables, logistic regression and generalized linear models.</w:t>
       </w:r>
     </w:p>
-    <w:bookmarkEnd w:id="32"/>
-    <w:bookmarkStart w:id="36" w:name="origin"/>
+    <w:bookmarkEnd w:id="33"/>
+    <w:bookmarkStart w:id="37" w:name="origin"/>
     <w:p>
       <w:pPr>
         <w:pStyle w:val="Heading2"/>
@@ -848,7 +874,7 @@
       <w:r>
         <w:t xml:space="preserve"> </w:t>
       </w:r>
-      <w:hyperlink r:id="rId33">
+      <w:hyperlink r:id="rId34">
         <w:r>
           <w:rPr>
             <w:rStyle w:val="Hyperlink"/>
@@ -1253,7 +1279,7 @@
       <w:r>
         <w:t xml:space="preserve"> </w:t>
       </w:r>
-      <w:hyperlink r:id="rId34">
+      <w:hyperlink r:id="rId35">
         <w:r>
           <w:rPr>
             <w:rStyle w:val="Hyperlink"/>
@@ -1270,7 +1296,7 @@
       <w:r>
         <w:t xml:space="preserve"> </w:t>
       </w:r>
-      <w:hyperlink r:id="rId35">
+      <w:hyperlink r:id="rId36">
         <w:r>
           <w:rPr>
             <w:rStyle w:val="Hyperlink"/>
@@ -1291,8 +1317,8 @@
         <w:t xml:space="preserve">which are the canonical home for the probability and mathematics appendices of rme.</w:t>
       </w:r>
     </w:p>
-    <w:bookmarkEnd w:id="36"/>
-    <w:bookmarkStart w:id="37" w:name="using-these-notes-in-another-site"/>
+    <w:bookmarkEnd w:id="37"/>
+    <w:bookmarkStart w:id="38" w:name="using-these-notes-in-another-site"/>
     <w:p>
       <w:pPr>
         <w:pStyle w:val="Heading2"/>
@@ -1443,7 +1469,7 @@
         <w:t xml:space="preserve">.</w:t>
       </w:r>
     </w:p>
-    <w:bookmarkEnd w:id="37"/>
+    <w:bookmarkEnd w:id="38"/>
     <w:sectPr>
       <w:footnotePr>
         <w:numRestart w:val="eachSect"/>

</xml_diff>

<commit_message>
Deploying to gh-pages from @ Morrison-Lab/sds@2b7298a89a256dd9f39ef7125da982b1a3f3940f 🚀
</commit_message>
<xml_diff>
--- a/index.docx
+++ b/index.docx
@@ -15,7 +15,7 @@
         <w:pStyle w:val="Date"/>
       </w:pPr>
       <w:r>
-        <w:t xml:space="preserve">Last modified: 2026-10-15 08:49:51 (PDT)</w:t>
+        <w:t xml:space="preserve">Last modified: 2026-10-15 09:04:24 (PDT)</w:t>
       </w:r>
     </w:p>
     <w:p>
@@ -26,7 +26,7 @@
         <w:t xml:space="preserve">These notes collect the statistics that data science courses assume.</w:t>
       </w:r>
     </w:p>
-    <w:bookmarkStart w:id="27" w:name="topics"/>
+    <w:bookmarkStart w:id="28" w:name="topics"/>
     <w:p>
       <w:pPr>
         <w:pStyle w:val="Heading2"/>
@@ -298,6 +298,32 @@
     </w:p>
     <w:p>
       <w:pPr>
+        <w:pStyle w:val="Compact"/>
+        <w:numPr>
+          <w:ilvl w:val="0"/>
+          <w:numId w:val="1002"/>
+        </w:numPr>
+      </w:pPr>
+      <w:hyperlink r:id="rId16">
+        <w:r>
+          <w:rPr>
+            <w:rStyle w:val="Hyperlink"/>
+          </w:rPr>
+          <w:t xml:space="preserve">Sufficiency and the Rao–Blackwell theorem</w:t>
+        </w:r>
+      </w:hyperlink>
+      <w:r>
+        <w:t xml:space="preserve">:</w:t>
+      </w:r>
+      <w:r>
+        <w:t xml:space="preserve"> </w:t>
+      </w:r>
+      <w:r>
+        <w:t xml:space="preserve">sufficient statistics, the factorization theorem, and improving an unbiased estimator.</w:t>
+      </w:r>
+    </w:p>
+    <w:p>
+      <w:pPr>
         <w:pStyle w:val="FirstParagraph"/>
       </w:pPr>
       <w:r>
@@ -312,7 +338,7 @@
           <w:numId w:val="1003"/>
         </w:numPr>
       </w:pPr>
-      <w:hyperlink r:id="rId16">
+      <w:hyperlink r:id="rId17">
         <w:r>
           <w:rPr>
             <w:rStyle w:val="Hyperlink"/>
@@ -338,7 +364,7 @@
           <w:numId w:val="1003"/>
         </w:numPr>
       </w:pPr>
-      <w:hyperlink r:id="rId17">
+      <w:hyperlink r:id="rId18">
         <w:r>
           <w:rPr>
             <w:rStyle w:val="Hyperlink"/>
@@ -364,7 +390,7 @@
           <w:numId w:val="1003"/>
         </w:numPr>
       </w:pPr>
-      <w:hyperlink r:id="rId18">
+      <w:hyperlink r:id="rId19">
         <w:r>
           <w:rPr>
             <w:rStyle w:val="Hyperlink"/>
@@ -384,7 +410,7 @@
           <w:numId w:val="1003"/>
         </w:numPr>
       </w:pPr>
-      <w:hyperlink r:id="rId19">
+      <w:hyperlink r:id="rId20">
         <w:r>
           <w:rPr>
             <w:rStyle w:val="Hyperlink"/>
@@ -404,7 +430,7 @@
           <w:numId w:val="1003"/>
         </w:numPr>
       </w:pPr>
-      <w:hyperlink r:id="rId20">
+      <w:hyperlink r:id="rId21">
         <w:r>
           <w:rPr>
             <w:rStyle w:val="Hyperlink"/>
@@ -436,7 +462,7 @@
           <w:numId w:val="1003"/>
         </w:numPr>
       </w:pPr>
-      <w:hyperlink r:id="rId21">
+      <w:hyperlink r:id="rId22">
         <w:r>
           <w:rPr>
             <w:rStyle w:val="Hyperlink"/>
@@ -474,7 +500,7 @@
           <w:numId w:val="1003"/>
         </w:numPr>
       </w:pPr>
-      <w:hyperlink r:id="rId22">
+      <w:hyperlink r:id="rId23">
         <w:r>
           <w:rPr>
             <w:rStyle w:val="Hyperlink"/>
@@ -517,7 +543,7 @@
           <w:numId w:val="1003"/>
         </w:numPr>
       </w:pPr>
-      <w:hyperlink r:id="rId23">
+      <w:hyperlink r:id="rId24">
         <w:r>
           <w:rPr>
             <w:rStyle w:val="Hyperlink"/>
@@ -557,7 +583,7 @@
           <w:numId w:val="1004"/>
         </w:numPr>
       </w:pPr>
-      <w:hyperlink r:id="rId24">
+      <w:hyperlink r:id="rId25">
         <w:r>
           <w:rPr>
             <w:rStyle w:val="Hyperlink"/>
@@ -583,7 +609,7 @@
           <w:numId w:val="1004"/>
         </w:numPr>
       </w:pPr>
-      <w:hyperlink r:id="rId25">
+      <w:hyperlink r:id="rId26">
         <w:r>
           <w:rPr>
             <w:rStyle w:val="Hyperlink"/>
@@ -615,7 +641,7 @@
           <w:numId w:val="1004"/>
         </w:numPr>
       </w:pPr>
-      <w:hyperlink r:id="rId26">
+      <w:hyperlink r:id="rId27">
         <w:r>
           <w:rPr>
             <w:rStyle w:val="Hyperlink"/>
@@ -639,8 +665,8 @@
         <w:t xml:space="preserve">and Bayesian model averaging.</w:t>
       </w:r>
     </w:p>
-    <w:bookmarkEnd w:id="27"/>
-    <w:bookmarkStart w:id="33" w:name="comparable-courses"/>
+    <w:bookmarkEnd w:id="28"/>
+    <w:bookmarkStart w:id="34" w:name="comparable-courses"/>
     <w:p>
       <w:pPr>
         <w:pStyle w:val="Heading2"/>
@@ -684,7 +710,7 @@
       <w:r>
         <w:t xml:space="preserve"> </w:t>
       </w:r>
-      <w:hyperlink r:id="rId28">
+      <w:hyperlink r:id="rId29">
         <w:r>
           <w:rPr>
             <w:rStyle w:val="Hyperlink"/>
@@ -741,7 +767,7 @@
       <w:r>
         <w:t xml:space="preserve"> </w:t>
       </w:r>
-      <w:hyperlink r:id="rId29">
+      <w:hyperlink r:id="rId30">
         <w:r>
           <w:rPr>
             <w:rStyle w:val="Hyperlink"/>
@@ -760,7 +786,7 @@
       <w:r>
         <w:t xml:space="preserve"> </w:t>
       </w:r>
-      <w:hyperlink r:id="rId30">
+      <w:hyperlink r:id="rId31">
         <w:r>
           <w:rPr>
             <w:rStyle w:val="Hyperlink"/>
@@ -799,7 +825,7 @@
       <w:r>
         <w:t xml:space="preserve"> </w:t>
       </w:r>
-      <w:hyperlink r:id="rId31">
+      <w:hyperlink r:id="rId32">
         <w:r>
           <w:rPr>
             <w:rStyle w:val="Hyperlink"/>
@@ -837,7 +863,7 @@
       <w:r>
         <w:t xml:space="preserve"> </w:t>
       </w:r>
-      <w:hyperlink r:id="rId32">
+      <w:hyperlink r:id="rId33">
         <w:r>
           <w:rPr>
             <w:rStyle w:val="Hyperlink"/>
@@ -854,8 +880,8 @@
         <w:t xml:space="preserve">(Jonathan Taylor): contingency tables, logistic regression and generalized linear models.</w:t>
       </w:r>
     </w:p>
-    <w:bookmarkEnd w:id="33"/>
-    <w:bookmarkStart w:id="37" w:name="origin"/>
+    <w:bookmarkEnd w:id="34"/>
+    <w:bookmarkStart w:id="38" w:name="origin"/>
     <w:p>
       <w:pPr>
         <w:pStyle w:val="Heading2"/>
@@ -874,7 +900,7 @@
       <w:r>
         <w:t xml:space="preserve"> </w:t>
       </w:r>
-      <w:hyperlink r:id="rId34">
+      <w:hyperlink r:id="rId35">
         <w:r>
           <w:rPr>
             <w:rStyle w:val="Hyperlink"/>
@@ -1279,7 +1305,7 @@
       <w:r>
         <w:t xml:space="preserve"> </w:t>
       </w:r>
-      <w:hyperlink r:id="rId35">
+      <w:hyperlink r:id="rId36">
         <w:r>
           <w:rPr>
             <w:rStyle w:val="Hyperlink"/>
@@ -1296,7 +1322,7 @@
       <w:r>
         <w:t xml:space="preserve"> </w:t>
       </w:r>
-      <w:hyperlink r:id="rId36">
+      <w:hyperlink r:id="rId37">
         <w:r>
           <w:rPr>
             <w:rStyle w:val="Hyperlink"/>
@@ -1317,8 +1343,8 @@
         <w:t xml:space="preserve">which are the canonical home for the probability and mathematics appendices of rme.</w:t>
       </w:r>
     </w:p>
-    <w:bookmarkEnd w:id="37"/>
-    <w:bookmarkStart w:id="38" w:name="using-these-notes-in-another-site"/>
+    <w:bookmarkEnd w:id="38"/>
+    <w:bookmarkStart w:id="39" w:name="using-these-notes-in-another-site"/>
     <w:p>
       <w:pPr>
         <w:pStyle w:val="Heading2"/>
@@ -1469,7 +1495,7 @@
         <w:t xml:space="preserve">.</w:t>
       </w:r>
     </w:p>
-    <w:bookmarkEnd w:id="38"/>
+    <w:bookmarkEnd w:id="39"/>
     <w:sectPr>
       <w:footnotePr>
         <w:numRestart w:val="eachSect"/>

</xml_diff>

<commit_message>
Deploying to gh-pages from @ Morrison-Lab/sds@a99d9017206d50ce0717489f5c9189488b81489d 🚀
</commit_message>
<xml_diff>
--- a/index.docx
+++ b/index.docx
@@ -15,7 +15,7 @@
         <w:pStyle w:val="Date"/>
       </w:pPr>
       <w:r>
-        <w:t xml:space="preserve">Last modified: 2026-10-22 02:04:59 (PDT)</w:t>
+        <w:t xml:space="preserve">Last modified: 2026-10-22 02:34:23 (PDT)</w:t>
       </w:r>
     </w:p>
     <w:p>
@@ -26,7 +26,7 @@
         <w:t xml:space="preserve">These notes collect the statistics that data science courses assume.</w:t>
       </w:r>
     </w:p>
-    <w:bookmarkStart w:id="29" w:name="topics"/>
+    <w:bookmarkStart w:id="30" w:name="topics"/>
     <w:p>
       <w:pPr>
         <w:pStyle w:val="Heading2"/>
@@ -309,7 +309,7 @@
           <w:rPr>
             <w:rStyle w:val="Hyperlink"/>
           </w:rPr>
-          <w:t xml:space="preserve">Properties of estimators</w:t>
+          <w:t xml:space="preserve">Maximum likelihood for a Gaussian model</w:t>
         </w:r>
       </w:hyperlink>
       <w:r>
@@ -319,7 +319,7 @@
         <w:t xml:space="preserve"> </w:t>
       </w:r>
       <w:r>
-        <w:t xml:space="preserve">consistency, relative efficiency, and the Cramér–Rao lower bound.</w:t>
+        <w:t xml:space="preserve">a worked derivation for Gaussian data;</w:t>
       </w:r>
     </w:p>
     <w:p>
@@ -331,6 +331,32 @@
         </w:numPr>
       </w:pPr>
       <w:hyperlink r:id="rId17">
+        <w:r>
+          <w:rPr>
+            <w:rStyle w:val="Hyperlink"/>
+          </w:rPr>
+          <w:t xml:space="preserve">Properties of estimators</w:t>
+        </w:r>
+      </w:hyperlink>
+      <w:r>
+        <w:t xml:space="preserve">:</w:t>
+      </w:r>
+      <w:r>
+        <w:t xml:space="preserve"> </w:t>
+      </w:r>
+      <w:r>
+        <w:t xml:space="preserve">consistency, relative efficiency, and the Cramér–Rao lower bound.</w:t>
+      </w:r>
+    </w:p>
+    <w:p>
+      <w:pPr>
+        <w:pStyle w:val="Compact"/>
+        <w:numPr>
+          <w:ilvl w:val="0"/>
+          <w:numId w:val="1002"/>
+        </w:numPr>
+      </w:pPr>
+      <w:hyperlink r:id="rId18">
         <w:r>
           <w:rPr>
             <w:rStyle w:val="Hyperlink"/>
@@ -364,7 +390,7 @@
           <w:numId w:val="1003"/>
         </w:numPr>
       </w:pPr>
-      <w:hyperlink r:id="rId18">
+      <w:hyperlink r:id="rId19">
         <w:r>
           <w:rPr>
             <w:rStyle w:val="Hyperlink"/>
@@ -390,7 +416,7 @@
           <w:numId w:val="1003"/>
         </w:numPr>
       </w:pPr>
-      <w:hyperlink r:id="rId19">
+      <w:hyperlink r:id="rId20">
         <w:r>
           <w:rPr>
             <w:rStyle w:val="Hyperlink"/>
@@ -416,7 +442,7 @@
           <w:numId w:val="1003"/>
         </w:numPr>
       </w:pPr>
-      <w:hyperlink r:id="rId20">
+      <w:hyperlink r:id="rId21">
         <w:r>
           <w:rPr>
             <w:rStyle w:val="Hyperlink"/>
@@ -436,7 +462,7 @@
           <w:numId w:val="1003"/>
         </w:numPr>
       </w:pPr>
-      <w:hyperlink r:id="rId21">
+      <w:hyperlink r:id="rId22">
         <w:r>
           <w:rPr>
             <w:rStyle w:val="Hyperlink"/>
@@ -456,7 +482,7 @@
           <w:numId w:val="1003"/>
         </w:numPr>
       </w:pPr>
-      <w:hyperlink r:id="rId22">
+      <w:hyperlink r:id="rId23">
         <w:r>
           <w:rPr>
             <w:rStyle w:val="Hyperlink"/>
@@ -488,7 +514,7 @@
           <w:numId w:val="1003"/>
         </w:numPr>
       </w:pPr>
-      <w:hyperlink r:id="rId23">
+      <w:hyperlink r:id="rId24">
         <w:r>
           <w:rPr>
             <w:rStyle w:val="Hyperlink"/>
@@ -526,7 +552,7 @@
           <w:numId w:val="1003"/>
         </w:numPr>
       </w:pPr>
-      <w:hyperlink r:id="rId24">
+      <w:hyperlink r:id="rId25">
         <w:r>
           <w:rPr>
             <w:rStyle w:val="Hyperlink"/>
@@ -569,7 +595,7 @@
           <w:numId w:val="1003"/>
         </w:numPr>
       </w:pPr>
-      <w:hyperlink r:id="rId25">
+      <w:hyperlink r:id="rId26">
         <w:r>
           <w:rPr>
             <w:rStyle w:val="Hyperlink"/>
@@ -609,7 +635,7 @@
           <w:numId w:val="1004"/>
         </w:numPr>
       </w:pPr>
-      <w:hyperlink r:id="rId26">
+      <w:hyperlink r:id="rId27">
         <w:r>
           <w:rPr>
             <w:rStyle w:val="Hyperlink"/>
@@ -635,7 +661,7 @@
           <w:numId w:val="1004"/>
         </w:numPr>
       </w:pPr>
-      <w:hyperlink r:id="rId27">
+      <w:hyperlink r:id="rId28">
         <w:r>
           <w:rPr>
             <w:rStyle w:val="Hyperlink"/>
@@ -667,7 +693,7 @@
           <w:numId w:val="1004"/>
         </w:numPr>
       </w:pPr>
-      <w:hyperlink r:id="rId28">
+      <w:hyperlink r:id="rId29">
         <w:r>
           <w:rPr>
             <w:rStyle w:val="Hyperlink"/>
@@ -691,8 +717,8 @@
         <w:t xml:space="preserve">and Bayesian model averaging.</w:t>
       </w:r>
     </w:p>
-    <w:bookmarkEnd w:id="29"/>
-    <w:bookmarkStart w:id="35" w:name="comparable-courses"/>
+    <w:bookmarkEnd w:id="30"/>
+    <w:bookmarkStart w:id="36" w:name="comparable-courses"/>
     <w:p>
       <w:pPr>
         <w:pStyle w:val="Heading2"/>
@@ -736,7 +762,7 @@
       <w:r>
         <w:t xml:space="preserve"> </w:t>
       </w:r>
-      <w:hyperlink r:id="rId30">
+      <w:hyperlink r:id="rId31">
         <w:r>
           <w:rPr>
             <w:rStyle w:val="Hyperlink"/>
@@ -793,7 +819,7 @@
       <w:r>
         <w:t xml:space="preserve"> </w:t>
       </w:r>
-      <w:hyperlink r:id="rId31">
+      <w:hyperlink r:id="rId32">
         <w:r>
           <w:rPr>
             <w:rStyle w:val="Hyperlink"/>
@@ -812,7 +838,7 @@
       <w:r>
         <w:t xml:space="preserve"> </w:t>
       </w:r>
-      <w:hyperlink r:id="rId32">
+      <w:hyperlink r:id="rId33">
         <w:r>
           <w:rPr>
             <w:rStyle w:val="Hyperlink"/>
@@ -851,7 +877,7 @@
       <w:r>
         <w:t xml:space="preserve"> </w:t>
       </w:r>
-      <w:hyperlink r:id="rId33">
+      <w:hyperlink r:id="rId34">
         <w:r>
           <w:rPr>
             <w:rStyle w:val="Hyperlink"/>
@@ -889,7 +915,7 @@
       <w:r>
         <w:t xml:space="preserve"> </w:t>
       </w:r>
-      <w:hyperlink r:id="rId34">
+      <w:hyperlink r:id="rId35">
         <w:r>
           <w:rPr>
             <w:rStyle w:val="Hyperlink"/>
@@ -906,8 +932,8 @@
         <w:t xml:space="preserve">(Jonathan Taylor): contingency tables, logistic regression and generalized linear models.</w:t>
       </w:r>
     </w:p>
-    <w:bookmarkEnd w:id="35"/>
-    <w:bookmarkStart w:id="39" w:name="origin"/>
+    <w:bookmarkEnd w:id="36"/>
+    <w:bookmarkStart w:id="40" w:name="origin"/>
     <w:p>
       <w:pPr>
         <w:pStyle w:val="Heading2"/>
@@ -926,7 +952,7 @@
       <w:r>
         <w:t xml:space="preserve"> </w:t>
       </w:r>
-      <w:hyperlink r:id="rId36">
+      <w:hyperlink r:id="rId37">
         <w:r>
           <w:rPr>
             <w:rStyle w:val="Hyperlink"/>
@@ -1331,7 +1357,7 @@
       <w:r>
         <w:t xml:space="preserve"> </w:t>
       </w:r>
-      <w:hyperlink r:id="rId37">
+      <w:hyperlink r:id="rId38">
         <w:r>
           <w:rPr>
             <w:rStyle w:val="Hyperlink"/>
@@ -1348,7 +1374,7 @@
       <w:r>
         <w:t xml:space="preserve"> </w:t>
       </w:r>
-      <w:hyperlink r:id="rId38">
+      <w:hyperlink r:id="rId39">
         <w:r>
           <w:rPr>
             <w:rStyle w:val="Hyperlink"/>
@@ -1369,8 +1395,8 @@
         <w:t xml:space="preserve">which are the canonical home for the probability and mathematics appendices of rme.</w:t>
       </w:r>
     </w:p>
-    <w:bookmarkEnd w:id="39"/>
-    <w:bookmarkStart w:id="40" w:name="using-these-notes-in-another-site"/>
+    <w:bookmarkEnd w:id="40"/>
+    <w:bookmarkStart w:id="41" w:name="using-these-notes-in-another-site"/>
     <w:p>
       <w:pPr>
         <w:pStyle w:val="Heading2"/>
@@ -1521,7 +1547,7 @@
         <w:t xml:space="preserve">.</w:t>
       </w:r>
     </w:p>
-    <w:bookmarkEnd w:id="40"/>
+    <w:bookmarkEnd w:id="41"/>
     <w:sectPr>
       <w:footnotePr>
         <w:numRestart w:val="eachSect"/>

</xml_diff>

<commit_message>
Deploying to gh-pages from @ Morrison-Lab/sds@3395fe35a1cabb1c5059e455921e9f37067a21eb 🚀
</commit_message>
<xml_diff>
--- a/index.docx
+++ b/index.docx
@@ -15,7 +15,7 @@
         <w:pStyle w:val="Date"/>
       </w:pPr>
       <w:r>
-        <w:t xml:space="preserve">Last modified: 2026-10-22 02:34:23 (PDT)</w:t>
+        <w:t xml:space="preserve">Last modified: 2026-10-22 09:54:26 (PDT)</w:t>
       </w:r>
     </w:p>
     <w:p>
@@ -26,7 +26,7 @@
         <w:t xml:space="preserve">These notes collect the statistics that data science courses assume.</w:t>
       </w:r>
     </w:p>
-    <w:bookmarkStart w:id="30" w:name="topics"/>
+    <w:bookmarkStart w:id="28" w:name="topics"/>
     <w:p>
       <w:pPr>
         <w:pStyle w:val="Heading2"/>
@@ -283,7 +283,7 @@
           <w:rPr>
             <w:rStyle w:val="Hyperlink"/>
           </w:rPr>
-          <w:t xml:space="preserve">Maximum likelihood for a Bernoulli model</w:t>
+          <w:t xml:space="preserve">Properties of estimators</w:t>
         </w:r>
       </w:hyperlink>
       <w:r>
@@ -293,7 +293,7 @@
         <w:t xml:space="preserve"> </w:t>
       </w:r>
       <w:r>
-        <w:t xml:space="preserve">a worked derivation for Bernoulli data;</w:t>
+        <w:t xml:space="preserve">consistency, relative efficiency, and the Cramér–Rao lower bound.</w:t>
       </w:r>
     </w:p>
     <w:p>
@@ -305,58 +305,6 @@
         </w:numPr>
       </w:pPr>
       <w:hyperlink r:id="rId16">
-        <w:r>
-          <w:rPr>
-            <w:rStyle w:val="Hyperlink"/>
-          </w:rPr>
-          <w:t xml:space="preserve">Maximum likelihood for a Gaussian model</w:t>
-        </w:r>
-      </w:hyperlink>
-      <w:r>
-        <w:t xml:space="preserve">:</w:t>
-      </w:r>
-      <w:r>
-        <w:t xml:space="preserve"> </w:t>
-      </w:r>
-      <w:r>
-        <w:t xml:space="preserve">a worked derivation for Gaussian data;</w:t>
-      </w:r>
-    </w:p>
-    <w:p>
-      <w:pPr>
-        <w:pStyle w:val="Compact"/>
-        <w:numPr>
-          <w:ilvl w:val="0"/>
-          <w:numId w:val="1002"/>
-        </w:numPr>
-      </w:pPr>
-      <w:hyperlink r:id="rId17">
-        <w:r>
-          <w:rPr>
-            <w:rStyle w:val="Hyperlink"/>
-          </w:rPr>
-          <w:t xml:space="preserve">Properties of estimators</w:t>
-        </w:r>
-      </w:hyperlink>
-      <w:r>
-        <w:t xml:space="preserve">:</w:t>
-      </w:r>
-      <w:r>
-        <w:t xml:space="preserve"> </w:t>
-      </w:r>
-      <w:r>
-        <w:t xml:space="preserve">consistency, relative efficiency, and the Cramér–Rao lower bound.</w:t>
-      </w:r>
-    </w:p>
-    <w:p>
-      <w:pPr>
-        <w:pStyle w:val="Compact"/>
-        <w:numPr>
-          <w:ilvl w:val="0"/>
-          <w:numId w:val="1002"/>
-        </w:numPr>
-      </w:pPr>
-      <w:hyperlink r:id="rId18">
         <w:r>
           <w:rPr>
             <w:rStyle w:val="Hyperlink"/>
@@ -390,7 +338,7 @@
           <w:numId w:val="1003"/>
         </w:numPr>
       </w:pPr>
-      <w:hyperlink r:id="rId19">
+      <w:hyperlink r:id="rId17">
         <w:r>
           <w:rPr>
             <w:rStyle w:val="Hyperlink"/>
@@ -416,7 +364,7 @@
           <w:numId w:val="1003"/>
         </w:numPr>
       </w:pPr>
-      <w:hyperlink r:id="rId20">
+      <w:hyperlink r:id="rId18">
         <w:r>
           <w:rPr>
             <w:rStyle w:val="Hyperlink"/>
@@ -442,7 +390,7 @@
           <w:numId w:val="1003"/>
         </w:numPr>
       </w:pPr>
-      <w:hyperlink r:id="rId21">
+      <w:hyperlink r:id="rId19">
         <w:r>
           <w:rPr>
             <w:rStyle w:val="Hyperlink"/>
@@ -462,7 +410,7 @@
           <w:numId w:val="1003"/>
         </w:numPr>
       </w:pPr>
-      <w:hyperlink r:id="rId22">
+      <w:hyperlink r:id="rId20">
         <w:r>
           <w:rPr>
             <w:rStyle w:val="Hyperlink"/>
@@ -482,7 +430,7 @@
           <w:numId w:val="1003"/>
         </w:numPr>
       </w:pPr>
-      <w:hyperlink r:id="rId23">
+      <w:hyperlink r:id="rId21">
         <w:r>
           <w:rPr>
             <w:rStyle w:val="Hyperlink"/>
@@ -514,7 +462,7 @@
           <w:numId w:val="1003"/>
         </w:numPr>
       </w:pPr>
-      <w:hyperlink r:id="rId24">
+      <w:hyperlink r:id="rId22">
         <w:r>
           <w:rPr>
             <w:rStyle w:val="Hyperlink"/>
@@ -552,7 +500,7 @@
           <w:numId w:val="1003"/>
         </w:numPr>
       </w:pPr>
-      <w:hyperlink r:id="rId25">
+      <w:hyperlink r:id="rId23">
         <w:r>
           <w:rPr>
             <w:rStyle w:val="Hyperlink"/>
@@ -595,7 +543,7 @@
           <w:numId w:val="1003"/>
         </w:numPr>
       </w:pPr>
-      <w:hyperlink r:id="rId26">
+      <w:hyperlink r:id="rId24">
         <w:r>
           <w:rPr>
             <w:rStyle w:val="Hyperlink"/>
@@ -635,7 +583,7 @@
           <w:numId w:val="1004"/>
         </w:numPr>
       </w:pPr>
-      <w:hyperlink r:id="rId27">
+      <w:hyperlink r:id="rId25">
         <w:r>
           <w:rPr>
             <w:rStyle w:val="Hyperlink"/>
@@ -661,7 +609,7 @@
           <w:numId w:val="1004"/>
         </w:numPr>
       </w:pPr>
-      <w:hyperlink r:id="rId28">
+      <w:hyperlink r:id="rId26">
         <w:r>
           <w:rPr>
             <w:rStyle w:val="Hyperlink"/>
@@ -693,7 +641,7 @@
           <w:numId w:val="1004"/>
         </w:numPr>
       </w:pPr>
-      <w:hyperlink r:id="rId29">
+      <w:hyperlink r:id="rId27">
         <w:r>
           <w:rPr>
             <w:rStyle w:val="Hyperlink"/>
@@ -717,8 +665,8 @@
         <w:t xml:space="preserve">and Bayesian model averaging.</w:t>
       </w:r>
     </w:p>
-    <w:bookmarkEnd w:id="30"/>
-    <w:bookmarkStart w:id="36" w:name="comparable-courses"/>
+    <w:bookmarkEnd w:id="28"/>
+    <w:bookmarkStart w:id="34" w:name="comparable-courses"/>
     <w:p>
       <w:pPr>
         <w:pStyle w:val="Heading2"/>
@@ -762,7 +710,7 @@
       <w:r>
         <w:t xml:space="preserve"> </w:t>
       </w:r>
-      <w:hyperlink r:id="rId31">
+      <w:hyperlink r:id="rId29">
         <w:r>
           <w:rPr>
             <w:rStyle w:val="Hyperlink"/>
@@ -819,7 +767,7 @@
       <w:r>
         <w:t xml:space="preserve"> </w:t>
       </w:r>
-      <w:hyperlink r:id="rId32">
+      <w:hyperlink r:id="rId30">
         <w:r>
           <w:rPr>
             <w:rStyle w:val="Hyperlink"/>
@@ -838,7 +786,7 @@
       <w:r>
         <w:t xml:space="preserve"> </w:t>
       </w:r>
-      <w:hyperlink r:id="rId33">
+      <w:hyperlink r:id="rId31">
         <w:r>
           <w:rPr>
             <w:rStyle w:val="Hyperlink"/>
@@ -877,7 +825,7 @@
       <w:r>
         <w:t xml:space="preserve"> </w:t>
       </w:r>
-      <w:hyperlink r:id="rId34">
+      <w:hyperlink r:id="rId32">
         <w:r>
           <w:rPr>
             <w:rStyle w:val="Hyperlink"/>
@@ -915,7 +863,7 @@
       <w:r>
         <w:t xml:space="preserve"> </w:t>
       </w:r>
-      <w:hyperlink r:id="rId35">
+      <w:hyperlink r:id="rId33">
         <w:r>
           <w:rPr>
             <w:rStyle w:val="Hyperlink"/>
@@ -932,8 +880,8 @@
         <w:t xml:space="preserve">(Jonathan Taylor): contingency tables, logistic regression and generalized linear models.</w:t>
       </w:r>
     </w:p>
-    <w:bookmarkEnd w:id="36"/>
-    <w:bookmarkStart w:id="40" w:name="origin"/>
+    <w:bookmarkEnd w:id="34"/>
+    <w:bookmarkStart w:id="38" w:name="origin"/>
     <w:p>
       <w:pPr>
         <w:pStyle w:val="Heading2"/>
@@ -952,7 +900,7 @@
       <w:r>
         <w:t xml:space="preserve"> </w:t>
       </w:r>
-      <w:hyperlink r:id="rId37">
+      <w:hyperlink r:id="rId35">
         <w:r>
           <w:rPr>
             <w:rStyle w:val="Hyperlink"/>
@@ -1357,7 +1305,7 @@
       <w:r>
         <w:t xml:space="preserve"> </w:t>
       </w:r>
-      <w:hyperlink r:id="rId38">
+      <w:hyperlink r:id="rId36">
         <w:r>
           <w:rPr>
             <w:rStyle w:val="Hyperlink"/>
@@ -1374,7 +1322,7 @@
       <w:r>
         <w:t xml:space="preserve"> </w:t>
       </w:r>
-      <w:hyperlink r:id="rId39">
+      <w:hyperlink r:id="rId37">
         <w:r>
           <w:rPr>
             <w:rStyle w:val="Hyperlink"/>
@@ -1395,8 +1343,8 @@
         <w:t xml:space="preserve">which are the canonical home for the probability and mathematics appendices of rme.</w:t>
       </w:r>
     </w:p>
-    <w:bookmarkEnd w:id="40"/>
-    <w:bookmarkStart w:id="41" w:name="using-these-notes-in-another-site"/>
+    <w:bookmarkEnd w:id="38"/>
+    <w:bookmarkStart w:id="39" w:name="using-these-notes-in-another-site"/>
     <w:p>
       <w:pPr>
         <w:pStyle w:val="Heading2"/>
@@ -1547,7 +1495,7 @@
         <w:t xml:space="preserve">.</w:t>
       </w:r>
     </w:p>
-    <w:bookmarkEnd w:id="41"/>
+    <w:bookmarkEnd w:id="39"/>
     <w:sectPr>
       <w:footnotePr>
         <w:numRestart w:val="eachSect"/>

</xml_diff>